<commit_message>
Just formatting no content changes
</commit_message>
<xml_diff>
--- a/internet and mobile programming task 1.docx
+++ b/internet and mobile programming task 1.docx
@@ -96,7 +96,6 @@
     <w:p>
       <w:pPr>
         <w:spacing w:line="240" w:lineRule="auto"/>
-        <w:jc w:val="center"/>
         <w:rPr>
           <w:rFonts w:ascii="Times New Roman" w:eastAsia="Times New Roman" w:hAnsi="Times New Roman" w:cs="Times New Roman"/>
           <w:b/>
@@ -108,7 +107,7 @@
     </w:p>
     <w:p>
       <w:pPr>
-        <w:spacing w:line="240" w:lineRule="auto"/>
+        <w:spacing w:before="0" w:beforeAutospacing="0" w:line="360" w:lineRule="auto"/>
         <w:jc w:val="center"/>
         <w:rPr>
           <w:rFonts w:ascii="Times New Roman" w:eastAsia="Times New Roman" w:hAnsi="Times New Roman" w:cs="Times New Roman"/>
@@ -118,11 +117,7 @@
           <w:szCs w:val="32"/>
         </w:rPr>
       </w:pPr>
-    </w:p>
-    <w:p>
-      <w:pPr>
-        <w:spacing w:line="240" w:lineRule="auto"/>
-        <w:jc w:val="center"/>
+      <w:r>
         <w:rPr>
           <w:rFonts w:ascii="Times New Roman" w:eastAsia="Times New Roman" w:hAnsi="Times New Roman" w:cs="Times New Roman"/>
           <w:b/>
@@ -130,11 +125,12 @@
           <w:sz w:val="32"/>
           <w:szCs w:val="32"/>
         </w:rPr>
-      </w:pPr>
-    </w:p>
-    <w:p>
-      <w:pPr>
-        <w:spacing w:line="360" w:lineRule="auto"/>
+        <w:t>UNIVERSITY OF BUEA</w:t>
+      </w:r>
+    </w:p>
+    <w:p>
+      <w:pPr>
+        <w:spacing w:before="0" w:beforeAutospacing="0" w:line="360" w:lineRule="auto"/>
         <w:jc w:val="center"/>
         <w:rPr>
           <w:rFonts w:ascii="Times New Roman" w:eastAsia="Times New Roman" w:hAnsi="Times New Roman" w:cs="Times New Roman"/>
@@ -152,35 +148,12 @@
           <w:sz w:val="32"/>
           <w:szCs w:val="32"/>
         </w:rPr>
-        <w:t>UNIVERSITY OF BUEA</w:t>
-      </w:r>
-    </w:p>
-    <w:p>
-      <w:pPr>
-        <w:spacing w:line="360" w:lineRule="auto"/>
-        <w:jc w:val="center"/>
-        <w:rPr>
-          <w:rFonts w:ascii="Times New Roman" w:eastAsia="Times New Roman" w:hAnsi="Times New Roman" w:cs="Times New Roman"/>
-          <w:b/>
-          <w:color w:val="0D0D0D"/>
-          <w:sz w:val="32"/>
-          <w:szCs w:val="32"/>
-        </w:rPr>
-      </w:pPr>
-      <w:r>
-        <w:rPr>
-          <w:rFonts w:ascii="Times New Roman" w:eastAsia="Times New Roman" w:hAnsi="Times New Roman" w:cs="Times New Roman"/>
-          <w:b/>
-          <w:color w:val="0D0D0D"/>
-          <w:sz w:val="32"/>
-          <w:szCs w:val="32"/>
-        </w:rPr>
         <w:t>FACULTY OF ENGINEERING AND TECHNOLOGY</w:t>
       </w:r>
     </w:p>
     <w:p>
       <w:pPr>
-        <w:spacing w:line="360" w:lineRule="auto"/>
+        <w:spacing w:before="0" w:beforeAutospacing="0" w:line="360" w:lineRule="auto"/>
         <w:jc w:val="center"/>
         <w:rPr>
           <w:rFonts w:ascii="Times New Roman" w:eastAsia="Times New Roman" w:hAnsi="Times New Roman" w:cs="Times New Roman"/>
@@ -470,11 +443,7 @@
           <w:szCs w:val="32"/>
         </w:rPr>
       </w:pPr>
-    </w:p>
-    <w:p>
-      <w:pPr>
-        <w:spacing w:line="240" w:lineRule="auto"/>
-        <w:jc w:val="center"/>
+      <w:r>
         <w:rPr>
           <w:rFonts w:ascii="Times New Roman" w:eastAsia="Times New Roman" w:hAnsi="Times New Roman" w:cs="Times New Roman"/>
           <w:b/>
@@ -482,24 +451,16 @@
           <w:sz w:val="32"/>
           <w:szCs w:val="32"/>
         </w:rPr>
-      </w:pPr>
-      <w:r>
+        <w:t>Group 9</w:t>
+      </w:r>
+    </w:p>
+    <w:p>
+      <w:pPr>
+        <w:spacing w:before="0" w:beforeAutospacing="0" w:line="240" w:lineRule="auto"/>
+        <w:jc w:val="center"/>
         <w:rPr>
           <w:rFonts w:ascii="Times New Roman" w:eastAsia="Times New Roman" w:hAnsi="Times New Roman" w:cs="Times New Roman"/>
           <w:b/>
-          <w:color w:val="0D0D0D"/>
-          <w:sz w:val="32"/>
-          <w:szCs w:val="32"/>
-        </w:rPr>
-        <w:t>Group 9</w:t>
-      </w:r>
-    </w:p>
-    <w:p>
-      <w:pPr>
-        <w:spacing w:line="240" w:lineRule="auto"/>
-        <w:jc w:val="center"/>
-        <w:rPr>
-          <w:rFonts w:ascii="Times New Roman" w:eastAsia="Times New Roman" w:hAnsi="Times New Roman" w:cs="Times New Roman"/>
           <w:color w:val="0D0D0D"/>
           <w:sz w:val="32"/>
           <w:szCs w:val="32"/>
@@ -710,7 +671,6 @@
                 <w:sz w:val="24"/>
                 <w:szCs w:val="24"/>
               </w:rPr>
-              <w:lastRenderedPageBreak/>
               <w:t xml:space="preserve">NEIL AMBAYI MPOCHE </w:t>
             </w:r>
           </w:p>
@@ -952,6 +912,7 @@
           <w:sz w:val="24"/>
           <w:szCs w:val="24"/>
         </w:rPr>
+        <w:lastRenderedPageBreak/>
         <w:t>Task 1 Report</w:t>
       </w:r>
     </w:p>
@@ -1113,7 +1074,6 @@
           <w:sz w:val="24"/>
           <w:szCs w:val="24"/>
         </w:rPr>
-        <w:lastRenderedPageBreak/>
         <w:t>Native applications are developed specifically for one operating system such as Android or iOS.</w:t>
       </w:r>
     </w:p>
@@ -1289,6 +1249,7 @@
           <w:sz w:val="24"/>
           <w:szCs w:val="24"/>
         </w:rPr>
+        <w:lastRenderedPageBreak/>
         <w:t>Android -</w:t>
       </w:r>
       <w:r>
@@ -1784,7 +1745,6 @@
           <w:sz w:val="24"/>
           <w:szCs w:val="24"/>
         </w:rPr>
-        <w:lastRenderedPageBreak/>
         <w:t>Characteristics:</w:t>
       </w:r>
     </w:p>
@@ -1960,6 +1920,7 @@
           <w:sz w:val="24"/>
           <w:szCs w:val="24"/>
         </w:rPr>
+        <w:lastRenderedPageBreak/>
         <w:t>CSS</w:t>
       </w:r>
     </w:p>
@@ -2507,7 +2468,6 @@
           <w:sz w:val="24"/>
           <w:szCs w:val="24"/>
         </w:rPr>
-        <w:lastRenderedPageBreak/>
         <w:t>Characteristics:</w:t>
       </w:r>
     </w:p>
@@ -2685,6 +2645,7 @@
           <w:sz w:val="24"/>
           <w:szCs w:val="24"/>
         </w:rPr>
+        <w:lastRenderedPageBreak/>
         <w:t>React Native</w:t>
       </w:r>
     </w:p>
@@ -3132,7 +3093,6 @@
         <w:spacing w:after="0" w:afterAutospacing="0" w:line="360" w:lineRule="auto"/>
       </w:pPr>
       <w:r>
-        <w:lastRenderedPageBreak/>
         <w:t>Examples include:</w:t>
       </w:r>
     </w:p>
@@ -3179,6 +3139,7 @@
           <w:sz w:val="24"/>
           <w:szCs w:val="24"/>
         </w:rPr>
+        <w:lastRenderedPageBreak/>
         <w:t>Used mainly for Android development.</w:t>
       </w:r>
     </w:p>
@@ -3602,7 +3563,6 @@
           <w:sz w:val="24"/>
           <w:szCs w:val="24"/>
         </w:rPr>
-        <w:lastRenderedPageBreak/>
         <w:t>Swift</w:t>
       </w:r>
       <w:r>
@@ -3757,6 +3717,7 @@
           <w:sz w:val="24"/>
           <w:szCs w:val="24"/>
         </w:rPr>
+        <w:lastRenderedPageBreak/>
         <w:t>Disadvantages:</w:t>
       </w:r>
     </w:p>
@@ -4212,7 +4173,6 @@
           <w:sz w:val="24"/>
           <w:szCs w:val="24"/>
         </w:rPr>
-        <w:lastRenderedPageBreak/>
         <w:t>Smaller community than JavaScript</w:t>
       </w:r>
     </w:p>
@@ -4286,6 +4246,7 @@
           <w:sz w:val="24"/>
           <w:szCs w:val="24"/>
         </w:rPr>
+        <w:lastRenderedPageBreak/>
         <w:t>Frameworks help developers:</w:t>
       </w:r>
     </w:p>
@@ -4678,7 +4639,6 @@
           <w:sz w:val="24"/>
           <w:szCs w:val="24"/>
         </w:rPr>
-        <w:lastRenderedPageBreak/>
         <w:t>Fast development</w:t>
       </w:r>
     </w:p>
@@ -4820,6 +4780,7 @@
           <w:sz w:val="24"/>
           <w:szCs w:val="24"/>
         </w:rPr>
+        <w:lastRenderedPageBreak/>
         <w:t>E-commerce apps</w:t>
       </w:r>
     </w:p>
@@ -5179,7 +5140,6 @@
           <w:sz w:val="24"/>
           <w:szCs w:val="24"/>
         </w:rPr>
-        <w:lastRenderedPageBreak/>
         <w:t>Xamarin</w:t>
       </w:r>
     </w:p>
@@ -5337,6 +5297,7 @@
           <w:sz w:val="24"/>
           <w:szCs w:val="24"/>
         </w:rPr>
+        <w:lastRenderedPageBreak/>
         <w:t>Enterprise support</w:t>
       </w:r>
     </w:p>
@@ -5664,7 +5625,6 @@
           <w:sz w:val="24"/>
           <w:szCs w:val="24"/>
         </w:rPr>
-        <w:lastRenderedPageBreak/>
         <w:t xml:space="preserve">Advantages: </w:t>
       </w:r>
       <w:r>
@@ -5785,6 +5745,7 @@
           <w:sz w:val="24"/>
           <w:szCs w:val="24"/>
         </w:rPr>
+        <w:lastRenderedPageBreak/>
         <w:t xml:space="preserve">In this architecture, the </w:t>
       </w:r>
       <w:proofErr w:type="spellStart"/>
@@ -6205,7 +6166,6 @@
           <w:sz w:val="24"/>
           <w:szCs w:val="24"/>
         </w:rPr>
-        <w:lastRenderedPageBreak/>
         <w:t xml:space="preserve">This aims to ensure that requirements are </w:t>
       </w:r>
       <w:r>
@@ -6343,6 +6303,7 @@
           <w:sz w:val="24"/>
           <w:szCs w:val="24"/>
         </w:rPr>
+        <w:lastRenderedPageBreak/>
         <w:t>Resources like developers and application features like authentication, API integration, cloud storage are also factors which increase the cost of development of mobile applications.</w:t>
       </w:r>
     </w:p>

</xml_diff>

<commit_message>
Edit: Editted and formatted first and second sections in word document for better presentation and readability
</commit_message>
<xml_diff>
--- a/internet and mobile programming task 1.docx
+++ b/internet and mobile programming task 1.docx
@@ -971,36 +971,6 @@
     </w:p>
     <w:p>
       <w:pPr>
-        <w:pStyle w:val="NormalWeb"/>
-      </w:pPr>
-      <w:r>
-        <w:t>Examples include:</w:t>
-      </w:r>
-    </w:p>
-    <w:p>
-      <w:pPr>
-        <w:numPr>
-          <w:ilvl w:val="0"/>
-          <w:numId w:val="53"/>
-        </w:numPr>
-        <w:spacing w:after="100" w:afterAutospacing="1" w:line="240" w:lineRule="auto"/>
-        <w:rPr>
-          <w:rFonts w:ascii="Times New Roman" w:hAnsi="Times New Roman" w:cs="Times New Roman"/>
-          <w:sz w:val="24"/>
-          <w:szCs w:val="24"/>
-        </w:rPr>
-      </w:pPr>
-      <w:r>
-        <w:rPr>
-          <w:rFonts w:ascii="Times New Roman" w:hAnsi="Times New Roman" w:cs="Times New Roman"/>
-          <w:sz w:val="24"/>
-          <w:szCs w:val="24"/>
-        </w:rPr>
-        <w:t>WhatsApp</w:t>
-      </w:r>
-    </w:p>
-    <w:p>
-      <w:pPr>
         <w:pStyle w:val="Heading2"/>
         <w:numPr>
           <w:ilvl w:val="0"/>
@@ -1075,6 +1045,42 @@
           <w:szCs w:val="24"/>
         </w:rPr>
         <w:t>Native applications are developed specifically for one operating system such as Android or iOS.</w:t>
+      </w:r>
+      <w:r>
+        <w:rPr>
+          <w:rFonts w:ascii="Times New Roman" w:eastAsia="Times New Roman" w:hAnsi="Times New Roman" w:cs="Times New Roman"/>
+          <w:color w:val="0D0D0D"/>
+          <w:sz w:val="24"/>
+          <w:szCs w:val="24"/>
+        </w:rPr>
+        <w:t xml:space="preserve"> </w:t>
+      </w:r>
+      <w:r>
+        <w:rPr>
+          <w:rFonts w:ascii="Times New Roman" w:eastAsia="Times New Roman" w:hAnsi="Times New Roman" w:cs="Times New Roman"/>
+          <w:color w:val="0D0D0D"/>
+          <w:sz w:val="24"/>
+          <w:szCs w:val="24"/>
+        </w:rPr>
+        <w:t xml:space="preserve">By communicating directly with the OS APIs, they offer the highest performance, zero-latency UI transitions, and full access to device hardware such as high-speed sensors, cameras, and GPS. However, </w:t>
+      </w:r>
+      <w:r>
+        <w:rPr>
+          <w:rFonts w:ascii="Times New Roman" w:eastAsia="Times New Roman" w:hAnsi="Times New Roman" w:cs="Times New Roman"/>
+          <w:color w:val="0D0D0D"/>
+          <w:sz w:val="24"/>
+          <w:szCs w:val="24"/>
+        </w:rPr>
+        <w:t xml:space="preserve">due to the fact that they are developed for specific platforms, they require separate codebases leading to increased </w:t>
+      </w:r>
+      <w:r>
+        <w:rPr>
+          <w:rFonts w:ascii="Times New Roman" w:eastAsia="Times New Roman" w:hAnsi="Times New Roman" w:cs="Times New Roman"/>
+          <w:color w:val="0D0D0D"/>
+          <w:sz w:val="24"/>
+          <w:szCs w:val="24"/>
+        </w:rPr>
+        <w:t>development effort and maintenance costs.</w:t>
       </w:r>
     </w:p>
     <w:p>
@@ -1224,6 +1230,7 @@
           <w:sz w:val="24"/>
           <w:szCs w:val="24"/>
         </w:rPr>
+        <w:lastRenderedPageBreak/>
         <w:t>Technologies:</w:t>
       </w:r>
     </w:p>
@@ -1249,7 +1256,6 @@
           <w:sz w:val="24"/>
           <w:szCs w:val="24"/>
         </w:rPr>
-        <w:lastRenderedPageBreak/>
         <w:t>Android -</w:t>
       </w:r>
       <w:r>
@@ -1298,405 +1304,6 @@
     </w:p>
     <w:p>
       <w:pPr>
-        <w:spacing w:before="240" w:after="60" w:line="240" w:lineRule="auto"/>
-        <w:outlineLvl w:val="2"/>
-        <w:rPr>
-          <w:rFonts w:ascii="Times New Roman" w:eastAsia="Times New Roman" w:hAnsi="Times New Roman" w:cs="Times New Roman"/>
-          <w:b/>
-          <w:bCs/>
-          <w:color w:val="0D0D0D"/>
-          <w:sz w:val="24"/>
-          <w:szCs w:val="24"/>
-        </w:rPr>
-      </w:pPr>
-      <w:r>
-        <w:rPr>
-          <w:rFonts w:ascii="Times New Roman" w:eastAsia="Times New Roman" w:hAnsi="Times New Roman" w:cs="Times New Roman"/>
-          <w:b/>
-          <w:bCs/>
-          <w:color w:val="0D0D0D"/>
-          <w:sz w:val="24"/>
-          <w:szCs w:val="24"/>
-        </w:rPr>
-        <w:t>Advantages:</w:t>
-      </w:r>
-    </w:p>
-    <w:p>
-      <w:pPr>
-        <w:numPr>
-          <w:ilvl w:val="0"/>
-          <w:numId w:val="3"/>
-        </w:numPr>
-        <w:spacing w:line="390" w:lineRule="atLeast"/>
-        <w:ind w:left="360"/>
-        <w:rPr>
-          <w:rFonts w:ascii="Times New Roman" w:eastAsia="Times New Roman" w:hAnsi="Times New Roman" w:cs="Times New Roman"/>
-          <w:color w:val="0D0D0D"/>
-          <w:sz w:val="24"/>
-          <w:szCs w:val="24"/>
-        </w:rPr>
-      </w:pPr>
-      <w:r>
-        <w:rPr>
-          <w:rFonts w:ascii="Times New Roman" w:eastAsia="Times New Roman" w:hAnsi="Times New Roman" w:cs="Times New Roman"/>
-          <w:color w:val="0D0D0D"/>
-          <w:sz w:val="24"/>
-          <w:szCs w:val="24"/>
-        </w:rPr>
-        <w:t>Very fast performance</w:t>
-      </w:r>
-      <w:r>
-        <w:rPr>
-          <w:rFonts w:ascii="Times New Roman" w:eastAsia="Times New Roman" w:hAnsi="Times New Roman" w:cs="Times New Roman"/>
-          <w:color w:val="0D0D0D"/>
-          <w:sz w:val="24"/>
-          <w:szCs w:val="24"/>
-        </w:rPr>
-        <w:t>.</w:t>
-      </w:r>
-    </w:p>
-    <w:p>
-      <w:pPr>
-        <w:numPr>
-          <w:ilvl w:val="0"/>
-          <w:numId w:val="3"/>
-        </w:numPr>
-        <w:spacing w:line="390" w:lineRule="atLeast"/>
-        <w:ind w:left="360"/>
-        <w:rPr>
-          <w:rFonts w:ascii="Times New Roman" w:eastAsia="Times New Roman" w:hAnsi="Times New Roman" w:cs="Times New Roman"/>
-          <w:color w:val="0D0D0D"/>
-          <w:sz w:val="24"/>
-          <w:szCs w:val="24"/>
-        </w:rPr>
-      </w:pPr>
-      <w:r>
-        <w:rPr>
-          <w:rFonts w:ascii="Times New Roman" w:eastAsia="Times New Roman" w:hAnsi="Times New Roman" w:cs="Times New Roman"/>
-          <w:color w:val="0D0D0D"/>
-          <w:sz w:val="24"/>
-          <w:szCs w:val="24"/>
-        </w:rPr>
-        <w:t>Better user experience</w:t>
-      </w:r>
-      <w:r>
-        <w:rPr>
-          <w:rFonts w:ascii="Times New Roman" w:eastAsia="Times New Roman" w:hAnsi="Times New Roman" w:cs="Times New Roman"/>
-          <w:color w:val="0D0D0D"/>
-          <w:sz w:val="24"/>
-          <w:szCs w:val="24"/>
-        </w:rPr>
-        <w:t>.</w:t>
-      </w:r>
-    </w:p>
-    <w:p>
-      <w:pPr>
-        <w:numPr>
-          <w:ilvl w:val="0"/>
-          <w:numId w:val="3"/>
-        </w:numPr>
-        <w:spacing w:line="390" w:lineRule="atLeast"/>
-        <w:ind w:left="360"/>
-        <w:rPr>
-          <w:rFonts w:ascii="Times New Roman" w:eastAsia="Times New Roman" w:hAnsi="Times New Roman" w:cs="Times New Roman"/>
-          <w:color w:val="0D0D0D"/>
-          <w:sz w:val="24"/>
-          <w:szCs w:val="24"/>
-        </w:rPr>
-      </w:pPr>
-      <w:r>
-        <w:rPr>
-          <w:rFonts w:ascii="Times New Roman" w:eastAsia="Times New Roman" w:hAnsi="Times New Roman" w:cs="Times New Roman"/>
-          <w:color w:val="0D0D0D"/>
-          <w:sz w:val="24"/>
-          <w:szCs w:val="24"/>
-        </w:rPr>
-        <w:t>Full device integration</w:t>
-      </w:r>
-      <w:r>
-        <w:rPr>
-          <w:rFonts w:ascii="Times New Roman" w:eastAsia="Times New Roman" w:hAnsi="Times New Roman" w:cs="Times New Roman"/>
-          <w:color w:val="0D0D0D"/>
-          <w:sz w:val="24"/>
-          <w:szCs w:val="24"/>
-        </w:rPr>
-        <w:t>.</w:t>
-      </w:r>
-    </w:p>
-    <w:p>
-      <w:pPr>
-        <w:numPr>
-          <w:ilvl w:val="0"/>
-          <w:numId w:val="3"/>
-        </w:numPr>
-        <w:spacing w:line="390" w:lineRule="atLeast"/>
-        <w:ind w:left="360"/>
-        <w:rPr>
-          <w:rFonts w:ascii="Times New Roman" w:eastAsia="Times New Roman" w:hAnsi="Times New Roman" w:cs="Times New Roman"/>
-          <w:color w:val="0D0D0D"/>
-          <w:sz w:val="24"/>
-          <w:szCs w:val="24"/>
-        </w:rPr>
-      </w:pPr>
-      <w:r>
-        <w:rPr>
-          <w:rFonts w:ascii="Times New Roman" w:eastAsia="Times New Roman" w:hAnsi="Times New Roman" w:cs="Times New Roman"/>
-          <w:color w:val="0D0D0D"/>
-          <w:sz w:val="24"/>
-          <w:szCs w:val="24"/>
-        </w:rPr>
-        <w:t>High security</w:t>
-      </w:r>
-      <w:r>
-        <w:rPr>
-          <w:rFonts w:ascii="Times New Roman" w:eastAsia="Times New Roman" w:hAnsi="Times New Roman" w:cs="Times New Roman"/>
-          <w:color w:val="0D0D0D"/>
-          <w:sz w:val="24"/>
-          <w:szCs w:val="24"/>
-        </w:rPr>
-        <w:t>.</w:t>
-      </w:r>
-    </w:p>
-    <w:p>
-      <w:pPr>
-        <w:spacing w:before="240" w:after="60" w:line="240" w:lineRule="auto"/>
-        <w:outlineLvl w:val="2"/>
-        <w:rPr>
-          <w:rFonts w:ascii="Times New Roman" w:eastAsia="Times New Roman" w:hAnsi="Times New Roman" w:cs="Times New Roman"/>
-          <w:b/>
-          <w:bCs/>
-          <w:color w:val="0D0D0D"/>
-          <w:sz w:val="24"/>
-          <w:szCs w:val="24"/>
-        </w:rPr>
-      </w:pPr>
-      <w:r>
-        <w:rPr>
-          <w:rFonts w:ascii="Times New Roman" w:eastAsia="Times New Roman" w:hAnsi="Times New Roman" w:cs="Times New Roman"/>
-          <w:b/>
-          <w:bCs/>
-          <w:color w:val="0D0D0D"/>
-          <w:sz w:val="24"/>
-          <w:szCs w:val="24"/>
-        </w:rPr>
-        <w:t>Disadvantages:</w:t>
-      </w:r>
-    </w:p>
-    <w:p>
-      <w:pPr>
-        <w:numPr>
-          <w:ilvl w:val="0"/>
-          <w:numId w:val="4"/>
-        </w:numPr>
-        <w:spacing w:line="390" w:lineRule="atLeast"/>
-        <w:ind w:left="360"/>
-        <w:rPr>
-          <w:rFonts w:ascii="Times New Roman" w:eastAsia="Times New Roman" w:hAnsi="Times New Roman" w:cs="Times New Roman"/>
-          <w:color w:val="0D0D0D"/>
-          <w:sz w:val="24"/>
-          <w:szCs w:val="24"/>
-        </w:rPr>
-      </w:pPr>
-      <w:r>
-        <w:rPr>
-          <w:rFonts w:ascii="Times New Roman" w:eastAsia="Times New Roman" w:hAnsi="Times New Roman" w:cs="Times New Roman"/>
-          <w:color w:val="0D0D0D"/>
-          <w:sz w:val="24"/>
-          <w:szCs w:val="24"/>
-        </w:rPr>
-        <w:t>Expensive to develop</w:t>
-      </w:r>
-      <w:r>
-        <w:rPr>
-          <w:rFonts w:ascii="Times New Roman" w:eastAsia="Times New Roman" w:hAnsi="Times New Roman" w:cs="Times New Roman"/>
-          <w:color w:val="0D0D0D"/>
-          <w:sz w:val="24"/>
-          <w:szCs w:val="24"/>
-        </w:rPr>
-        <w:t>.</w:t>
-      </w:r>
-    </w:p>
-    <w:p>
-      <w:pPr>
-        <w:numPr>
-          <w:ilvl w:val="0"/>
-          <w:numId w:val="4"/>
-        </w:numPr>
-        <w:spacing w:line="390" w:lineRule="atLeast"/>
-        <w:ind w:left="360"/>
-        <w:rPr>
-          <w:rFonts w:ascii="Times New Roman" w:eastAsia="Times New Roman" w:hAnsi="Times New Roman" w:cs="Times New Roman"/>
-          <w:color w:val="0D0D0D"/>
-          <w:sz w:val="24"/>
-          <w:szCs w:val="24"/>
-        </w:rPr>
-      </w:pPr>
-      <w:r>
-        <w:rPr>
-          <w:rFonts w:ascii="Times New Roman" w:eastAsia="Times New Roman" w:hAnsi="Times New Roman" w:cs="Times New Roman"/>
-          <w:color w:val="0D0D0D"/>
-          <w:sz w:val="24"/>
-          <w:szCs w:val="24"/>
-        </w:rPr>
-        <w:t>Requires separate codebases</w:t>
-      </w:r>
-      <w:r>
-        <w:rPr>
-          <w:rFonts w:ascii="Times New Roman" w:eastAsia="Times New Roman" w:hAnsi="Times New Roman" w:cs="Times New Roman"/>
-          <w:color w:val="0D0D0D"/>
-          <w:sz w:val="24"/>
-          <w:szCs w:val="24"/>
-        </w:rPr>
-        <w:t>.</w:t>
-      </w:r>
-    </w:p>
-    <w:p>
-      <w:pPr>
-        <w:numPr>
-          <w:ilvl w:val="0"/>
-          <w:numId w:val="4"/>
-        </w:numPr>
-        <w:spacing w:line="390" w:lineRule="atLeast"/>
-        <w:ind w:left="360"/>
-        <w:rPr>
-          <w:rFonts w:ascii="Times New Roman" w:eastAsia="Times New Roman" w:hAnsi="Times New Roman" w:cs="Times New Roman"/>
-          <w:color w:val="0D0D0D"/>
-          <w:sz w:val="24"/>
-          <w:szCs w:val="24"/>
-        </w:rPr>
-      </w:pPr>
-      <w:r>
-        <w:rPr>
-          <w:rFonts w:ascii="Times New Roman" w:eastAsia="Times New Roman" w:hAnsi="Times New Roman" w:cs="Times New Roman"/>
-          <w:color w:val="0D0D0D"/>
-          <w:sz w:val="24"/>
-          <w:szCs w:val="24"/>
-        </w:rPr>
-        <w:t>Maintenance cost is high</w:t>
-      </w:r>
-      <w:r>
-        <w:rPr>
-          <w:rFonts w:ascii="Times New Roman" w:eastAsia="Times New Roman" w:hAnsi="Times New Roman" w:cs="Times New Roman"/>
-          <w:color w:val="0D0D0D"/>
-          <w:sz w:val="24"/>
-          <w:szCs w:val="24"/>
-        </w:rPr>
-        <w:t>.</w:t>
-      </w:r>
-    </w:p>
-    <w:p>
-      <w:pPr>
-        <w:spacing w:before="240" w:after="60" w:line="240" w:lineRule="auto"/>
-        <w:outlineLvl w:val="2"/>
-        <w:rPr>
-          <w:rFonts w:ascii="Times New Roman" w:eastAsia="Times New Roman" w:hAnsi="Times New Roman" w:cs="Times New Roman"/>
-          <w:b/>
-          <w:bCs/>
-          <w:color w:val="0D0D0D"/>
-          <w:sz w:val="24"/>
-          <w:szCs w:val="24"/>
-        </w:rPr>
-      </w:pPr>
-      <w:r>
-        <w:rPr>
-          <w:rFonts w:ascii="Times New Roman" w:eastAsia="Times New Roman" w:hAnsi="Times New Roman" w:cs="Times New Roman"/>
-          <w:b/>
-          <w:bCs/>
-          <w:color w:val="0D0D0D"/>
-          <w:sz w:val="24"/>
-          <w:szCs w:val="24"/>
-        </w:rPr>
-        <w:t>Examples:</w:t>
-      </w:r>
-    </w:p>
-    <w:p>
-      <w:pPr>
-        <w:numPr>
-          <w:ilvl w:val="0"/>
-          <w:numId w:val="5"/>
-        </w:numPr>
-        <w:spacing w:line="390" w:lineRule="atLeast"/>
-        <w:ind w:left="360"/>
-        <w:rPr>
-          <w:rFonts w:ascii="Times New Roman" w:eastAsia="Times New Roman" w:hAnsi="Times New Roman" w:cs="Times New Roman"/>
-          <w:color w:val="0D0D0D"/>
-          <w:sz w:val="24"/>
-          <w:szCs w:val="24"/>
-        </w:rPr>
-      </w:pPr>
-      <w:r>
-        <w:rPr>
-          <w:rFonts w:ascii="Times New Roman" w:eastAsia="Times New Roman" w:hAnsi="Times New Roman" w:cs="Times New Roman"/>
-          <w:color w:val="0D0D0D"/>
-          <w:sz w:val="24"/>
-          <w:szCs w:val="24"/>
-        </w:rPr>
-        <w:t>WhatsApp</w:t>
-      </w:r>
-    </w:p>
-    <w:p>
-      <w:pPr>
-        <w:numPr>
-          <w:ilvl w:val="0"/>
-          <w:numId w:val="5"/>
-        </w:numPr>
-        <w:spacing w:line="390" w:lineRule="atLeast"/>
-        <w:ind w:left="360"/>
-        <w:rPr>
-          <w:rFonts w:ascii="Times New Roman" w:eastAsia="Times New Roman" w:hAnsi="Times New Roman" w:cs="Times New Roman"/>
-          <w:color w:val="0D0D0D"/>
-          <w:sz w:val="24"/>
-          <w:szCs w:val="24"/>
-        </w:rPr>
-      </w:pPr>
-      <w:r>
-        <w:rPr>
-          <w:rFonts w:ascii="Times New Roman" w:eastAsia="Times New Roman" w:hAnsi="Times New Roman" w:cs="Times New Roman"/>
-          <w:color w:val="0D0D0D"/>
-          <w:sz w:val="24"/>
-          <w:szCs w:val="24"/>
-        </w:rPr>
-        <w:t>Facebook</w:t>
-      </w:r>
-    </w:p>
-    <w:p>
-      <w:pPr>
-        <w:numPr>
-          <w:ilvl w:val="0"/>
-          <w:numId w:val="5"/>
-        </w:numPr>
-        <w:spacing w:line="390" w:lineRule="atLeast"/>
-        <w:ind w:left="360"/>
-        <w:rPr>
-          <w:rFonts w:ascii="Times New Roman" w:eastAsia="Times New Roman" w:hAnsi="Times New Roman" w:cs="Times New Roman"/>
-          <w:color w:val="0D0D0D"/>
-          <w:sz w:val="24"/>
-          <w:szCs w:val="24"/>
-        </w:rPr>
-      </w:pPr>
-      <w:r>
-        <w:rPr>
-          <w:rFonts w:ascii="Times New Roman" w:eastAsia="Times New Roman" w:hAnsi="Times New Roman" w:cs="Times New Roman"/>
-          <w:color w:val="0D0D0D"/>
-          <w:sz w:val="24"/>
-          <w:szCs w:val="24"/>
-        </w:rPr>
-        <w:t>Instagram</w:t>
-      </w:r>
-    </w:p>
-    <w:p>
-      <w:pPr>
-        <w:spacing w:line="390" w:lineRule="atLeast"/>
-        <w:rPr>
-          <w:rFonts w:ascii="Times New Roman" w:eastAsia="Times New Roman" w:hAnsi="Times New Roman" w:cs="Times New Roman"/>
-          <w:color w:val="0D0D0D"/>
-          <w:sz w:val="24"/>
-          <w:szCs w:val="24"/>
-        </w:rPr>
-      </w:pPr>
-    </w:p>
-    <w:p>
-      <w:pPr>
         <w:pStyle w:val="Heading3"/>
       </w:pPr>
       <w:r>
@@ -1721,6 +1328,15 @@
           <w:szCs w:val="24"/>
         </w:rPr>
         <w:t>PWAs are web applications that behave like mobile apps but run in browsers.</w:t>
+      </w:r>
+      <w:r>
+        <w:rPr>
+          <w:rFonts w:ascii="Times New Roman" w:eastAsia="Times New Roman" w:hAnsi="Times New Roman" w:cs="Times New Roman"/>
+          <w:color w:val="0D0D0D"/>
+          <w:sz w:val="24"/>
+          <w:szCs w:val="24"/>
+        </w:rPr>
+        <w:t xml:space="preserve"> They are highly cost-effective and instantly deployable without app store approval.</w:t>
       </w:r>
     </w:p>
     <w:p>
@@ -1772,6 +1388,15 @@
         </w:rPr>
         <w:t>Built using web technologies</w:t>
       </w:r>
+      <w:r>
+        <w:rPr>
+          <w:rFonts w:ascii="Times New Roman" w:eastAsia="Times New Roman" w:hAnsi="Times New Roman" w:cs="Times New Roman"/>
+          <w:color w:val="0D0D0D"/>
+          <w:sz w:val="24"/>
+          <w:szCs w:val="24"/>
+        </w:rPr>
+        <w:t>.</w:t>
+      </w:r>
     </w:p>
     <w:p>
       <w:pPr>
@@ -1797,6 +1422,15 @@
         </w:rPr>
         <w:t>No installation required (optional install)</w:t>
       </w:r>
+      <w:r>
+        <w:rPr>
+          <w:rFonts w:ascii="Times New Roman" w:eastAsia="Times New Roman" w:hAnsi="Times New Roman" w:cs="Times New Roman"/>
+          <w:color w:val="0D0D0D"/>
+          <w:sz w:val="24"/>
+          <w:szCs w:val="24"/>
+        </w:rPr>
+        <w:t>.</w:t>
+      </w:r>
     </w:p>
     <w:p>
       <w:pPr>
@@ -1822,6 +1456,15 @@
         </w:rPr>
         <w:t>Works offline (using caching)</w:t>
       </w:r>
+      <w:r>
+        <w:rPr>
+          <w:rFonts w:ascii="Times New Roman" w:eastAsia="Times New Roman" w:hAnsi="Times New Roman" w:cs="Times New Roman"/>
+          <w:color w:val="0D0D0D"/>
+          <w:sz w:val="24"/>
+          <w:szCs w:val="24"/>
+        </w:rPr>
+        <w:t>.</w:t>
+      </w:r>
     </w:p>
     <w:p>
       <w:pPr>
@@ -1847,6 +1490,15 @@
         </w:rPr>
         <w:t>Cross platform</w:t>
       </w:r>
+      <w:r>
+        <w:rPr>
+          <w:rFonts w:ascii="Times New Roman" w:eastAsia="Times New Roman" w:hAnsi="Times New Roman" w:cs="Times New Roman"/>
+          <w:color w:val="0D0D0D"/>
+          <w:sz w:val="24"/>
+          <w:szCs w:val="24"/>
+        </w:rPr>
+        <w:t>.</w:t>
+      </w:r>
     </w:p>
     <w:p>
       <w:pPr>
@@ -1871,6 +1523,31 @@
           <w:szCs w:val="24"/>
         </w:rPr>
         <w:t>Technologies:</w:t>
+      </w:r>
+    </w:p>
+    <w:p>
+      <w:pPr>
+        <w:numPr>
+          <w:ilvl w:val="0"/>
+          <w:numId w:val="7"/>
+        </w:numPr>
+        <w:spacing w:before="0" w:beforeAutospacing="0" w:line="390" w:lineRule="atLeast"/>
+        <w:ind w:left="360"/>
+        <w:rPr>
+          <w:rFonts w:ascii="Times New Roman" w:eastAsia="Times New Roman" w:hAnsi="Times New Roman" w:cs="Times New Roman"/>
+          <w:color w:val="0D0D0D"/>
+          <w:sz w:val="24"/>
+          <w:szCs w:val="24"/>
+        </w:rPr>
+      </w:pPr>
+      <w:r>
+        <w:rPr>
+          <w:rFonts w:ascii="Times New Roman" w:eastAsia="Times New Roman" w:hAnsi="Times New Roman" w:cs="Times New Roman"/>
+          <w:color w:val="0D0D0D"/>
+          <w:sz w:val="24"/>
+          <w:szCs w:val="24"/>
+        </w:rPr>
+        <w:t>HTML</w:t>
       </w:r>
     </w:p>
     <w:p>
@@ -1895,7 +1572,7 @@
           <w:sz w:val="24"/>
           <w:szCs w:val="24"/>
         </w:rPr>
-        <w:t>HTML</w:t>
+        <w:t>CSS</w:t>
       </w:r>
     </w:p>
     <w:p>
@@ -1920,8 +1597,7 @@
           <w:sz w:val="24"/>
           <w:szCs w:val="24"/>
         </w:rPr>
-        <w:lastRenderedPageBreak/>
-        <w:t>CSS</w:t>
+        <w:t>JavaScript</w:t>
       </w:r>
     </w:p>
     <w:p>
@@ -1946,38 +1622,33 @@
           <w:sz w:val="24"/>
           <w:szCs w:val="24"/>
         </w:rPr>
-        <w:t>JavaScript</w:t>
-      </w:r>
-    </w:p>
-    <w:p>
-      <w:pPr>
-        <w:numPr>
-          <w:ilvl w:val="0"/>
-          <w:numId w:val="7"/>
-        </w:numPr>
+        <w:t>Service Workers</w:t>
+      </w:r>
+    </w:p>
+    <w:p>
+      <w:pPr>
         <w:spacing w:line="390" w:lineRule="atLeast"/>
-        <w:ind w:left="360"/>
-        <w:rPr>
-          <w:rFonts w:ascii="Times New Roman" w:eastAsia="Times New Roman" w:hAnsi="Times New Roman" w:cs="Times New Roman"/>
-          <w:color w:val="0D0D0D"/>
-          <w:sz w:val="24"/>
-          <w:szCs w:val="24"/>
-        </w:rPr>
-      </w:pPr>
-      <w:r>
-        <w:rPr>
-          <w:rFonts w:ascii="Times New Roman" w:eastAsia="Times New Roman" w:hAnsi="Times New Roman" w:cs="Times New Roman"/>
-          <w:color w:val="0D0D0D"/>
-          <w:sz w:val="24"/>
-          <w:szCs w:val="24"/>
-        </w:rPr>
-        <w:t>Service Workers</w:t>
-      </w:r>
-    </w:p>
-    <w:p>
-      <w:pPr>
-        <w:spacing w:before="240" w:after="60" w:line="240" w:lineRule="auto"/>
-        <w:outlineLvl w:val="2"/>
+        <w:rPr>
+          <w:rFonts w:ascii="Times New Roman" w:eastAsia="Times New Roman" w:hAnsi="Times New Roman" w:cs="Times New Roman"/>
+          <w:color w:val="0D0D0D"/>
+          <w:sz w:val="24"/>
+          <w:szCs w:val="24"/>
+        </w:rPr>
+      </w:pPr>
+      <w:r>
+        <w:rPr>
+          <w:rFonts w:ascii="Times New Roman" w:eastAsia="Times New Roman" w:hAnsi="Times New Roman" w:cs="Times New Roman"/>
+          <w:color w:val="0D0D0D"/>
+          <w:sz w:val="24"/>
+          <w:szCs w:val="24"/>
+        </w:rPr>
+        <w:t>Examples include Twitter Lite, Starbucks PWA, Pinterest PWA.</w:t>
+      </w:r>
+    </w:p>
+    <w:p>
+      <w:pPr>
+        <w:spacing w:after="60" w:line="240" w:lineRule="auto"/>
+        <w:outlineLvl w:val="1"/>
         <w:rPr>
           <w:rFonts w:ascii="Times New Roman" w:eastAsia="Times New Roman" w:hAnsi="Times New Roman" w:cs="Times New Roman"/>
           <w:b/>
@@ -1996,433 +1667,6 @@
           <w:sz w:val="24"/>
           <w:szCs w:val="24"/>
         </w:rPr>
-        <w:t>Advantages:</w:t>
-      </w:r>
-    </w:p>
-    <w:p>
-      <w:pPr>
-        <w:numPr>
-          <w:ilvl w:val="0"/>
-          <w:numId w:val="8"/>
-        </w:numPr>
-        <w:spacing w:line="390" w:lineRule="atLeast"/>
-        <w:ind w:left="360"/>
-        <w:rPr>
-          <w:rFonts w:ascii="Times New Roman" w:eastAsia="Times New Roman" w:hAnsi="Times New Roman" w:cs="Times New Roman"/>
-          <w:color w:val="0D0D0D"/>
-          <w:sz w:val="24"/>
-          <w:szCs w:val="24"/>
-        </w:rPr>
-      </w:pPr>
-      <w:r>
-        <w:rPr>
-          <w:rFonts w:ascii="Times New Roman" w:eastAsia="Times New Roman" w:hAnsi="Times New Roman" w:cs="Times New Roman"/>
-          <w:color w:val="0D0D0D"/>
-          <w:sz w:val="24"/>
-          <w:szCs w:val="24"/>
-        </w:rPr>
-        <w:t>Relatively c</w:t>
-      </w:r>
-      <w:r>
-        <w:rPr>
-          <w:rFonts w:ascii="Times New Roman" w:eastAsia="Times New Roman" w:hAnsi="Times New Roman" w:cs="Times New Roman"/>
-          <w:color w:val="0D0D0D"/>
-          <w:sz w:val="24"/>
-          <w:szCs w:val="24"/>
-        </w:rPr>
-        <w:t>heap</w:t>
-      </w:r>
-      <w:r>
-        <w:rPr>
-          <w:rFonts w:ascii="Times New Roman" w:eastAsia="Times New Roman" w:hAnsi="Times New Roman" w:cs="Times New Roman"/>
-          <w:color w:val="0D0D0D"/>
-          <w:sz w:val="24"/>
-          <w:szCs w:val="24"/>
-        </w:rPr>
-        <w:t>er</w:t>
-      </w:r>
-      <w:r>
-        <w:rPr>
-          <w:rFonts w:ascii="Times New Roman" w:eastAsia="Times New Roman" w:hAnsi="Times New Roman" w:cs="Times New Roman"/>
-          <w:color w:val="0D0D0D"/>
-          <w:sz w:val="24"/>
-          <w:szCs w:val="24"/>
-        </w:rPr>
-        <w:t xml:space="preserve"> to develop</w:t>
-      </w:r>
-      <w:r>
-        <w:rPr>
-          <w:rFonts w:ascii="Times New Roman" w:eastAsia="Times New Roman" w:hAnsi="Times New Roman" w:cs="Times New Roman"/>
-          <w:color w:val="0D0D0D"/>
-          <w:sz w:val="24"/>
-          <w:szCs w:val="24"/>
-        </w:rPr>
-        <w:t>.</w:t>
-      </w:r>
-    </w:p>
-    <w:p>
-      <w:pPr>
-        <w:numPr>
-          <w:ilvl w:val="0"/>
-          <w:numId w:val="8"/>
-        </w:numPr>
-        <w:spacing w:line="390" w:lineRule="atLeast"/>
-        <w:ind w:left="360"/>
-        <w:rPr>
-          <w:rFonts w:ascii="Times New Roman" w:eastAsia="Times New Roman" w:hAnsi="Times New Roman" w:cs="Times New Roman"/>
-          <w:color w:val="0D0D0D"/>
-          <w:sz w:val="24"/>
-          <w:szCs w:val="24"/>
-        </w:rPr>
-      </w:pPr>
-      <w:r>
-        <w:rPr>
-          <w:rFonts w:ascii="Times New Roman" w:eastAsia="Times New Roman" w:hAnsi="Times New Roman" w:cs="Times New Roman"/>
-          <w:color w:val="0D0D0D"/>
-          <w:sz w:val="24"/>
-          <w:szCs w:val="24"/>
-        </w:rPr>
-        <w:t>Fast deployment</w:t>
-      </w:r>
-      <w:r>
-        <w:rPr>
-          <w:rFonts w:ascii="Times New Roman" w:eastAsia="Times New Roman" w:hAnsi="Times New Roman" w:cs="Times New Roman"/>
-          <w:color w:val="0D0D0D"/>
-          <w:sz w:val="24"/>
-          <w:szCs w:val="24"/>
-        </w:rPr>
-        <w:t>.</w:t>
-      </w:r>
-    </w:p>
-    <w:p>
-      <w:pPr>
-        <w:numPr>
-          <w:ilvl w:val="0"/>
-          <w:numId w:val="8"/>
-        </w:numPr>
-        <w:spacing w:line="390" w:lineRule="atLeast"/>
-        <w:ind w:left="360"/>
-        <w:rPr>
-          <w:rFonts w:ascii="Times New Roman" w:eastAsia="Times New Roman" w:hAnsi="Times New Roman" w:cs="Times New Roman"/>
-          <w:color w:val="0D0D0D"/>
-          <w:sz w:val="24"/>
-          <w:szCs w:val="24"/>
-        </w:rPr>
-      </w:pPr>
-      <w:r>
-        <w:rPr>
-          <w:rFonts w:ascii="Times New Roman" w:eastAsia="Times New Roman" w:hAnsi="Times New Roman" w:cs="Times New Roman"/>
-          <w:color w:val="0D0D0D"/>
-          <w:sz w:val="24"/>
-          <w:szCs w:val="24"/>
-        </w:rPr>
-        <w:t>Cross platform</w:t>
-      </w:r>
-      <w:r>
-        <w:rPr>
-          <w:rFonts w:ascii="Times New Roman" w:eastAsia="Times New Roman" w:hAnsi="Times New Roman" w:cs="Times New Roman"/>
-          <w:color w:val="0D0D0D"/>
-          <w:sz w:val="24"/>
-          <w:szCs w:val="24"/>
-        </w:rPr>
-        <w:t>.</w:t>
-      </w:r>
-    </w:p>
-    <w:p>
-      <w:pPr>
-        <w:numPr>
-          <w:ilvl w:val="0"/>
-          <w:numId w:val="8"/>
-        </w:numPr>
-        <w:spacing w:line="390" w:lineRule="atLeast"/>
-        <w:ind w:left="360"/>
-        <w:rPr>
-          <w:rFonts w:ascii="Times New Roman" w:eastAsia="Times New Roman" w:hAnsi="Times New Roman" w:cs="Times New Roman"/>
-          <w:color w:val="0D0D0D"/>
-          <w:sz w:val="24"/>
-          <w:szCs w:val="24"/>
-        </w:rPr>
-      </w:pPr>
-      <w:r>
-        <w:rPr>
-          <w:rFonts w:ascii="Times New Roman" w:eastAsia="Times New Roman" w:hAnsi="Times New Roman" w:cs="Times New Roman"/>
-          <w:color w:val="0D0D0D"/>
-          <w:sz w:val="24"/>
-          <w:szCs w:val="24"/>
-        </w:rPr>
-        <w:t>No app store approval needed</w:t>
-      </w:r>
-      <w:r>
-        <w:rPr>
-          <w:rFonts w:ascii="Times New Roman" w:eastAsia="Times New Roman" w:hAnsi="Times New Roman" w:cs="Times New Roman"/>
-          <w:color w:val="0D0D0D"/>
-          <w:sz w:val="24"/>
-          <w:szCs w:val="24"/>
-        </w:rPr>
-        <w:t>.</w:t>
-      </w:r>
-    </w:p>
-    <w:p>
-      <w:pPr>
-        <w:spacing w:before="240" w:after="60" w:line="240" w:lineRule="auto"/>
-        <w:outlineLvl w:val="2"/>
-        <w:rPr>
-          <w:rFonts w:ascii="Times New Roman" w:eastAsia="Times New Roman" w:hAnsi="Times New Roman" w:cs="Times New Roman"/>
-          <w:b/>
-          <w:bCs/>
-          <w:color w:val="0D0D0D"/>
-          <w:sz w:val="24"/>
-          <w:szCs w:val="24"/>
-        </w:rPr>
-      </w:pPr>
-      <w:r>
-        <w:rPr>
-          <w:rFonts w:ascii="Times New Roman" w:eastAsia="Times New Roman" w:hAnsi="Times New Roman" w:cs="Times New Roman"/>
-          <w:b/>
-          <w:bCs/>
-          <w:color w:val="0D0D0D"/>
-          <w:sz w:val="24"/>
-          <w:szCs w:val="24"/>
-        </w:rPr>
-        <w:t>Disadvantages:</w:t>
-      </w:r>
-    </w:p>
-    <w:p>
-      <w:pPr>
-        <w:numPr>
-          <w:ilvl w:val="0"/>
-          <w:numId w:val="9"/>
-        </w:numPr>
-        <w:spacing w:line="390" w:lineRule="atLeast"/>
-        <w:ind w:left="360"/>
-        <w:rPr>
-          <w:rFonts w:ascii="Times New Roman" w:eastAsia="Times New Roman" w:hAnsi="Times New Roman" w:cs="Times New Roman"/>
-          <w:color w:val="0D0D0D"/>
-          <w:sz w:val="24"/>
-          <w:szCs w:val="24"/>
-        </w:rPr>
-      </w:pPr>
-      <w:r>
-        <w:rPr>
-          <w:rFonts w:ascii="Times New Roman" w:eastAsia="Times New Roman" w:hAnsi="Times New Roman" w:cs="Times New Roman"/>
-          <w:color w:val="0D0D0D"/>
-          <w:sz w:val="24"/>
-          <w:szCs w:val="24"/>
-        </w:rPr>
-        <w:t>Limited hardware access</w:t>
-      </w:r>
-      <w:r>
-        <w:rPr>
-          <w:rFonts w:ascii="Times New Roman" w:eastAsia="Times New Roman" w:hAnsi="Times New Roman" w:cs="Times New Roman"/>
-          <w:color w:val="0D0D0D"/>
-          <w:sz w:val="24"/>
-          <w:szCs w:val="24"/>
-        </w:rPr>
-        <w:t>.</w:t>
-      </w:r>
-    </w:p>
-    <w:p>
-      <w:pPr>
-        <w:numPr>
-          <w:ilvl w:val="0"/>
-          <w:numId w:val="9"/>
-        </w:numPr>
-        <w:spacing w:line="390" w:lineRule="atLeast"/>
-        <w:ind w:left="360"/>
-        <w:rPr>
-          <w:rFonts w:ascii="Times New Roman" w:eastAsia="Times New Roman" w:hAnsi="Times New Roman" w:cs="Times New Roman"/>
-          <w:color w:val="0D0D0D"/>
-          <w:sz w:val="24"/>
-          <w:szCs w:val="24"/>
-        </w:rPr>
-      </w:pPr>
-      <w:r>
-        <w:rPr>
-          <w:rFonts w:ascii="Times New Roman" w:eastAsia="Times New Roman" w:hAnsi="Times New Roman" w:cs="Times New Roman"/>
-          <w:color w:val="0D0D0D"/>
-          <w:sz w:val="24"/>
-          <w:szCs w:val="24"/>
-        </w:rPr>
-        <w:t>Lower performance than native apps</w:t>
-      </w:r>
-      <w:r>
-        <w:rPr>
-          <w:rFonts w:ascii="Times New Roman" w:eastAsia="Times New Roman" w:hAnsi="Times New Roman" w:cs="Times New Roman"/>
-          <w:color w:val="0D0D0D"/>
-          <w:sz w:val="24"/>
-          <w:szCs w:val="24"/>
-        </w:rPr>
-        <w:t>.</w:t>
-      </w:r>
-    </w:p>
-    <w:p>
-      <w:pPr>
-        <w:numPr>
-          <w:ilvl w:val="0"/>
-          <w:numId w:val="9"/>
-        </w:numPr>
-        <w:spacing w:line="390" w:lineRule="atLeast"/>
-        <w:ind w:left="360"/>
-        <w:rPr>
-          <w:rFonts w:ascii="Times New Roman" w:eastAsia="Times New Roman" w:hAnsi="Times New Roman" w:cs="Times New Roman"/>
-          <w:color w:val="0D0D0D"/>
-          <w:sz w:val="24"/>
-          <w:szCs w:val="24"/>
-        </w:rPr>
-      </w:pPr>
-      <w:r>
-        <w:rPr>
-          <w:rFonts w:ascii="Times New Roman" w:eastAsia="Times New Roman" w:hAnsi="Times New Roman" w:cs="Times New Roman"/>
-          <w:color w:val="0D0D0D"/>
-          <w:sz w:val="24"/>
-          <w:szCs w:val="24"/>
-        </w:rPr>
-        <w:t>Limited iOS support</w:t>
-      </w:r>
-      <w:r>
-        <w:rPr>
-          <w:rFonts w:ascii="Times New Roman" w:eastAsia="Times New Roman" w:hAnsi="Times New Roman" w:cs="Times New Roman"/>
-          <w:color w:val="0D0D0D"/>
-          <w:sz w:val="24"/>
-          <w:szCs w:val="24"/>
-        </w:rPr>
-        <w:t>.</w:t>
-      </w:r>
-    </w:p>
-    <w:p>
-      <w:pPr>
-        <w:spacing w:before="240" w:after="60" w:line="240" w:lineRule="auto"/>
-        <w:outlineLvl w:val="2"/>
-        <w:rPr>
-          <w:rFonts w:ascii="Times New Roman" w:eastAsia="Times New Roman" w:hAnsi="Times New Roman" w:cs="Times New Roman"/>
-          <w:b/>
-          <w:bCs/>
-          <w:color w:val="0D0D0D"/>
-          <w:sz w:val="24"/>
-          <w:szCs w:val="24"/>
-        </w:rPr>
-      </w:pPr>
-      <w:r>
-        <w:rPr>
-          <w:rFonts w:ascii="Times New Roman" w:eastAsia="Times New Roman" w:hAnsi="Times New Roman" w:cs="Times New Roman"/>
-          <w:b/>
-          <w:bCs/>
-          <w:color w:val="0D0D0D"/>
-          <w:sz w:val="24"/>
-          <w:szCs w:val="24"/>
-        </w:rPr>
-        <w:t>Examples:</w:t>
-      </w:r>
-    </w:p>
-    <w:p>
-      <w:pPr>
-        <w:numPr>
-          <w:ilvl w:val="0"/>
-          <w:numId w:val="10"/>
-        </w:numPr>
-        <w:spacing w:line="390" w:lineRule="atLeast"/>
-        <w:ind w:left="360"/>
-        <w:rPr>
-          <w:rFonts w:ascii="Times New Roman" w:eastAsia="Times New Roman" w:hAnsi="Times New Roman" w:cs="Times New Roman"/>
-          <w:color w:val="0D0D0D"/>
-          <w:sz w:val="24"/>
-          <w:szCs w:val="24"/>
-        </w:rPr>
-      </w:pPr>
-      <w:r>
-        <w:rPr>
-          <w:rFonts w:ascii="Times New Roman" w:eastAsia="Times New Roman" w:hAnsi="Times New Roman" w:cs="Times New Roman"/>
-          <w:color w:val="0D0D0D"/>
-          <w:sz w:val="24"/>
-          <w:szCs w:val="24"/>
-        </w:rPr>
-        <w:t>Twitter Lite</w:t>
-      </w:r>
-    </w:p>
-    <w:p>
-      <w:pPr>
-        <w:numPr>
-          <w:ilvl w:val="0"/>
-          <w:numId w:val="10"/>
-        </w:numPr>
-        <w:spacing w:line="390" w:lineRule="atLeast"/>
-        <w:ind w:left="360"/>
-        <w:rPr>
-          <w:rFonts w:ascii="Times New Roman" w:eastAsia="Times New Roman" w:hAnsi="Times New Roman" w:cs="Times New Roman"/>
-          <w:color w:val="0D0D0D"/>
-          <w:sz w:val="24"/>
-          <w:szCs w:val="24"/>
-        </w:rPr>
-      </w:pPr>
-      <w:r>
-        <w:rPr>
-          <w:rFonts w:ascii="Times New Roman" w:eastAsia="Times New Roman" w:hAnsi="Times New Roman" w:cs="Times New Roman"/>
-          <w:color w:val="0D0D0D"/>
-          <w:sz w:val="24"/>
-          <w:szCs w:val="24"/>
-        </w:rPr>
-        <w:t>Starbucks PWA</w:t>
-      </w:r>
-    </w:p>
-    <w:p>
-      <w:pPr>
-        <w:numPr>
-          <w:ilvl w:val="0"/>
-          <w:numId w:val="10"/>
-        </w:numPr>
-        <w:spacing w:line="390" w:lineRule="atLeast"/>
-        <w:ind w:left="360"/>
-        <w:rPr>
-          <w:rFonts w:ascii="Times New Roman" w:eastAsia="Times New Roman" w:hAnsi="Times New Roman" w:cs="Times New Roman"/>
-          <w:color w:val="0D0D0D"/>
-          <w:sz w:val="24"/>
-          <w:szCs w:val="24"/>
-        </w:rPr>
-      </w:pPr>
-      <w:r>
-        <w:rPr>
-          <w:rFonts w:ascii="Times New Roman" w:eastAsia="Times New Roman" w:hAnsi="Times New Roman" w:cs="Times New Roman"/>
-          <w:color w:val="0D0D0D"/>
-          <w:sz w:val="24"/>
-          <w:szCs w:val="24"/>
-        </w:rPr>
-        <w:t>Pinterest PWA</w:t>
-      </w:r>
-    </w:p>
-    <w:p>
-      <w:pPr>
-        <w:spacing w:after="60" w:line="240" w:lineRule="auto"/>
-        <w:outlineLvl w:val="1"/>
-        <w:rPr>
-          <w:rFonts w:ascii="Times New Roman" w:eastAsia="Times New Roman" w:hAnsi="Times New Roman" w:cs="Times New Roman"/>
-          <w:color w:val="0D0D0D"/>
-          <w:sz w:val="24"/>
-          <w:szCs w:val="24"/>
-        </w:rPr>
-      </w:pPr>
-    </w:p>
-    <w:p>
-      <w:pPr>
-        <w:spacing w:after="60" w:line="240" w:lineRule="auto"/>
-        <w:outlineLvl w:val="1"/>
-        <w:rPr>
-          <w:rFonts w:ascii="Times New Roman" w:eastAsia="Times New Roman" w:hAnsi="Times New Roman" w:cs="Times New Roman"/>
-          <w:b/>
-          <w:bCs/>
-          <w:color w:val="0D0D0D"/>
-          <w:sz w:val="24"/>
-          <w:szCs w:val="24"/>
-        </w:rPr>
-      </w:pPr>
-      <w:r>
-        <w:rPr>
-          <w:rFonts w:ascii="Times New Roman" w:eastAsia="Times New Roman" w:hAnsi="Times New Roman" w:cs="Times New Roman"/>
-          <w:b/>
-          <w:bCs/>
-          <w:color w:val="0D0D0D"/>
-          <w:sz w:val="24"/>
-          <w:szCs w:val="24"/>
-        </w:rPr>
         <w:t>1.3 Hybrid Applications</w:t>
       </w:r>
     </w:p>
@@ -2444,6 +1688,24 @@
           <w:szCs w:val="24"/>
         </w:rPr>
         <w:t>Hybrid apps combine native and web technologies.</w:t>
+      </w:r>
+      <w:r>
+        <w:rPr>
+          <w:rFonts w:ascii="Times New Roman" w:eastAsia="Times New Roman" w:hAnsi="Times New Roman" w:cs="Times New Roman"/>
+          <w:color w:val="0D0D0D"/>
+          <w:sz w:val="24"/>
+          <w:szCs w:val="24"/>
+        </w:rPr>
+        <w:t xml:space="preserve"> </w:t>
+      </w:r>
+      <w:r>
+        <w:rPr>
+          <w:rFonts w:ascii="Times New Roman" w:eastAsia="Times New Roman" w:hAnsi="Times New Roman" w:cs="Times New Roman"/>
+          <w:color w:val="0D0D0D"/>
+          <w:sz w:val="24"/>
+          <w:szCs w:val="24"/>
+        </w:rPr>
+        <w:t>They provide a strategic balance by significantly reducing time-to-market and development costs while maintaining a consistent user experience across both platforms</w:t>
       </w:r>
     </w:p>
     <w:p>
@@ -2620,6 +1882,7 @@
           <w:sz w:val="24"/>
           <w:szCs w:val="24"/>
         </w:rPr>
+        <w:lastRenderedPageBreak/>
         <w:t>Flutter</w:t>
       </w:r>
     </w:p>
@@ -2645,7 +1908,6 @@
           <w:sz w:val="24"/>
           <w:szCs w:val="24"/>
         </w:rPr>
-        <w:lastRenderedPageBreak/>
         <w:t>React Native</w:t>
       </w:r>
     </w:p>
@@ -2701,371 +1963,35 @@
     </w:p>
     <w:p>
       <w:pPr>
-        <w:spacing w:before="240" w:after="60" w:line="240" w:lineRule="auto"/>
-        <w:outlineLvl w:val="2"/>
-        <w:rPr>
-          <w:rFonts w:ascii="Times New Roman" w:eastAsia="Times New Roman" w:hAnsi="Times New Roman" w:cs="Times New Roman"/>
-          <w:b/>
-          <w:bCs/>
-          <w:color w:val="0D0D0D"/>
-          <w:sz w:val="24"/>
-          <w:szCs w:val="24"/>
-        </w:rPr>
-      </w:pPr>
-      <w:r>
-        <w:rPr>
-          <w:rFonts w:ascii="Times New Roman" w:eastAsia="Times New Roman" w:hAnsi="Times New Roman" w:cs="Times New Roman"/>
-          <w:b/>
-          <w:bCs/>
-          <w:color w:val="0D0D0D"/>
-          <w:sz w:val="24"/>
-          <w:szCs w:val="24"/>
-        </w:rPr>
-        <w:t>Advantages:</w:t>
-      </w:r>
-    </w:p>
-    <w:p>
-      <w:pPr>
+        <w:spacing w:line="390" w:lineRule="atLeast"/>
+        <w:ind w:left="360"/>
+        <w:rPr>
+          <w:rFonts w:ascii="Times New Roman" w:eastAsia="Times New Roman" w:hAnsi="Times New Roman" w:cs="Times New Roman"/>
+          <w:color w:val="0D0D0D"/>
+          <w:sz w:val="24"/>
+          <w:szCs w:val="24"/>
+        </w:rPr>
+      </w:pPr>
+      <w:r>
+        <w:rPr>
+          <w:rFonts w:ascii="Times New Roman" w:eastAsia="Times New Roman" w:hAnsi="Times New Roman" w:cs="Times New Roman"/>
+          <w:color w:val="0D0D0D"/>
+          <w:sz w:val="24"/>
+          <w:szCs w:val="24"/>
+        </w:rPr>
+        <w:t>Examples include Discord, Uber Eats.</w:t>
+      </w:r>
+    </w:p>
+    <w:p>
+      <w:pPr>
+        <w:pStyle w:val="Heading2"/>
         <w:numPr>
           <w:ilvl w:val="0"/>
-          <w:numId w:val="13"/>
+          <w:numId w:val="56"/>
         </w:numPr>
-        <w:spacing w:line="390" w:lineRule="atLeast"/>
-        <w:ind w:left="360"/>
-        <w:rPr>
-          <w:rFonts w:ascii="Times New Roman" w:eastAsia="Times New Roman" w:hAnsi="Times New Roman" w:cs="Times New Roman"/>
-          <w:color w:val="0D0D0D"/>
-          <w:sz w:val="24"/>
-          <w:szCs w:val="24"/>
-        </w:rPr>
-      </w:pPr>
-      <w:r>
-        <w:rPr>
-          <w:rFonts w:ascii="Times New Roman" w:eastAsia="Times New Roman" w:hAnsi="Times New Roman" w:cs="Times New Roman"/>
-          <w:color w:val="0D0D0D"/>
-          <w:sz w:val="24"/>
-          <w:szCs w:val="24"/>
-        </w:rPr>
-        <w:t>Relatively l</w:t>
-      </w:r>
-      <w:r>
-        <w:rPr>
-          <w:rFonts w:ascii="Times New Roman" w:eastAsia="Times New Roman" w:hAnsi="Times New Roman" w:cs="Times New Roman"/>
-          <w:color w:val="0D0D0D"/>
-          <w:sz w:val="24"/>
-          <w:szCs w:val="24"/>
-        </w:rPr>
-        <w:t>ower cost</w:t>
-      </w:r>
-    </w:p>
-    <w:p>
-      <w:pPr>
-        <w:numPr>
-          <w:ilvl w:val="0"/>
-          <w:numId w:val="13"/>
-        </w:numPr>
-        <w:spacing w:line="390" w:lineRule="atLeast"/>
-        <w:ind w:left="360"/>
-        <w:rPr>
-          <w:rFonts w:ascii="Times New Roman" w:eastAsia="Times New Roman" w:hAnsi="Times New Roman" w:cs="Times New Roman"/>
-          <w:color w:val="0D0D0D"/>
-          <w:sz w:val="24"/>
-          <w:szCs w:val="24"/>
-        </w:rPr>
-      </w:pPr>
-      <w:r>
-        <w:rPr>
-          <w:rFonts w:ascii="Times New Roman" w:eastAsia="Times New Roman" w:hAnsi="Times New Roman" w:cs="Times New Roman"/>
-          <w:color w:val="0D0D0D"/>
-          <w:sz w:val="24"/>
-          <w:szCs w:val="24"/>
-        </w:rPr>
-        <w:t>Faster development</w:t>
-      </w:r>
-      <w:r>
-        <w:rPr>
-          <w:rFonts w:ascii="Times New Roman" w:eastAsia="Times New Roman" w:hAnsi="Times New Roman" w:cs="Times New Roman"/>
-          <w:color w:val="0D0D0D"/>
-          <w:sz w:val="24"/>
-          <w:szCs w:val="24"/>
-        </w:rPr>
-        <w:t>.</w:t>
-      </w:r>
-    </w:p>
-    <w:p>
-      <w:pPr>
-        <w:numPr>
-          <w:ilvl w:val="0"/>
-          <w:numId w:val="13"/>
-        </w:numPr>
-        <w:spacing w:line="390" w:lineRule="atLeast"/>
-        <w:ind w:left="360"/>
-        <w:rPr>
-          <w:rFonts w:ascii="Times New Roman" w:eastAsia="Times New Roman" w:hAnsi="Times New Roman" w:cs="Times New Roman"/>
-          <w:color w:val="0D0D0D"/>
-          <w:sz w:val="24"/>
-          <w:szCs w:val="24"/>
-        </w:rPr>
-      </w:pPr>
-      <w:r>
-        <w:rPr>
-          <w:rFonts w:ascii="Times New Roman" w:eastAsia="Times New Roman" w:hAnsi="Times New Roman" w:cs="Times New Roman"/>
-          <w:color w:val="0D0D0D"/>
-          <w:sz w:val="24"/>
-          <w:szCs w:val="24"/>
-        </w:rPr>
-        <w:t>Cross platform support</w:t>
-      </w:r>
-      <w:r>
-        <w:rPr>
-          <w:rFonts w:ascii="Times New Roman" w:eastAsia="Times New Roman" w:hAnsi="Times New Roman" w:cs="Times New Roman"/>
-          <w:color w:val="0D0D0D"/>
-          <w:sz w:val="24"/>
-          <w:szCs w:val="24"/>
-        </w:rPr>
-        <w:t>.</w:t>
-      </w:r>
-    </w:p>
-    <w:p>
-      <w:pPr>
-        <w:numPr>
-          <w:ilvl w:val="0"/>
-          <w:numId w:val="13"/>
-        </w:numPr>
-        <w:spacing w:line="390" w:lineRule="atLeast"/>
-        <w:ind w:left="360"/>
-        <w:rPr>
-          <w:rFonts w:ascii="Times New Roman" w:eastAsia="Times New Roman" w:hAnsi="Times New Roman" w:cs="Times New Roman"/>
-          <w:color w:val="0D0D0D"/>
-          <w:sz w:val="24"/>
-          <w:szCs w:val="24"/>
-        </w:rPr>
-      </w:pPr>
-      <w:r>
-        <w:rPr>
-          <w:rFonts w:ascii="Times New Roman" w:eastAsia="Times New Roman" w:hAnsi="Times New Roman" w:cs="Times New Roman"/>
-          <w:color w:val="0D0D0D"/>
-          <w:sz w:val="24"/>
-          <w:szCs w:val="24"/>
-        </w:rPr>
-        <w:t>Code reuse</w:t>
-      </w:r>
-      <w:r>
-        <w:rPr>
-          <w:rFonts w:ascii="Times New Roman" w:eastAsia="Times New Roman" w:hAnsi="Times New Roman" w:cs="Times New Roman"/>
-          <w:color w:val="0D0D0D"/>
-          <w:sz w:val="24"/>
-          <w:szCs w:val="24"/>
-        </w:rPr>
-        <w:t>.</w:t>
-      </w:r>
-    </w:p>
-    <w:p>
-      <w:pPr>
-        <w:spacing w:before="240" w:after="60" w:line="240" w:lineRule="auto"/>
-        <w:outlineLvl w:val="2"/>
-        <w:rPr>
-          <w:rFonts w:ascii="Times New Roman" w:eastAsia="Times New Roman" w:hAnsi="Times New Roman" w:cs="Times New Roman"/>
-          <w:b/>
-          <w:bCs/>
-          <w:color w:val="0D0D0D"/>
-          <w:sz w:val="24"/>
-          <w:szCs w:val="24"/>
-        </w:rPr>
-      </w:pPr>
-      <w:r>
-        <w:rPr>
-          <w:rFonts w:ascii="Times New Roman" w:eastAsia="Times New Roman" w:hAnsi="Times New Roman" w:cs="Times New Roman"/>
-          <w:b/>
-          <w:bCs/>
-          <w:color w:val="0D0D0D"/>
-          <w:sz w:val="24"/>
-          <w:szCs w:val="24"/>
-        </w:rPr>
-        <w:t>Disadvantages:</w:t>
-      </w:r>
-    </w:p>
-    <w:p>
-      <w:pPr>
-        <w:numPr>
-          <w:ilvl w:val="0"/>
-          <w:numId w:val="14"/>
-        </w:numPr>
-        <w:spacing w:line="390" w:lineRule="atLeast"/>
-        <w:ind w:left="360"/>
-        <w:rPr>
-          <w:rFonts w:ascii="Times New Roman" w:eastAsia="Times New Roman" w:hAnsi="Times New Roman" w:cs="Times New Roman"/>
-          <w:color w:val="0D0D0D"/>
-          <w:sz w:val="24"/>
-          <w:szCs w:val="24"/>
-        </w:rPr>
-      </w:pPr>
-      <w:r>
-        <w:rPr>
-          <w:rFonts w:ascii="Times New Roman" w:eastAsia="Times New Roman" w:hAnsi="Times New Roman" w:cs="Times New Roman"/>
-          <w:color w:val="0D0D0D"/>
-          <w:sz w:val="24"/>
-          <w:szCs w:val="24"/>
-        </w:rPr>
-        <w:t>Slightly lower performance than native</w:t>
-      </w:r>
-    </w:p>
-    <w:p>
-      <w:pPr>
-        <w:numPr>
-          <w:ilvl w:val="0"/>
-          <w:numId w:val="14"/>
-        </w:numPr>
-        <w:spacing w:line="390" w:lineRule="atLeast"/>
-        <w:ind w:left="360"/>
-        <w:rPr>
-          <w:rFonts w:ascii="Times New Roman" w:eastAsia="Times New Roman" w:hAnsi="Times New Roman" w:cs="Times New Roman"/>
-          <w:color w:val="0D0D0D"/>
-          <w:sz w:val="24"/>
-          <w:szCs w:val="24"/>
-        </w:rPr>
-      </w:pPr>
-      <w:r>
-        <w:rPr>
-          <w:rFonts w:ascii="Times New Roman" w:eastAsia="Times New Roman" w:hAnsi="Times New Roman" w:cs="Times New Roman"/>
-          <w:color w:val="0D0D0D"/>
-          <w:sz w:val="24"/>
-          <w:szCs w:val="24"/>
-        </w:rPr>
-        <w:t>Sometimes UI not fully native</w:t>
-      </w:r>
-    </w:p>
-    <w:p>
-      <w:pPr>
-        <w:numPr>
-          <w:ilvl w:val="0"/>
-          <w:numId w:val="14"/>
-        </w:numPr>
-        <w:spacing w:line="390" w:lineRule="atLeast"/>
-        <w:ind w:left="360"/>
-        <w:rPr>
-          <w:rFonts w:ascii="Times New Roman" w:eastAsia="Times New Roman" w:hAnsi="Times New Roman" w:cs="Times New Roman"/>
-          <w:color w:val="0D0D0D"/>
-          <w:sz w:val="24"/>
-          <w:szCs w:val="24"/>
-        </w:rPr>
-      </w:pPr>
-      <w:r>
-        <w:rPr>
-          <w:rFonts w:ascii="Times New Roman" w:eastAsia="Times New Roman" w:hAnsi="Times New Roman" w:cs="Times New Roman"/>
-          <w:color w:val="0D0D0D"/>
-          <w:sz w:val="24"/>
-          <w:szCs w:val="24"/>
-        </w:rPr>
-        <w:t>Debugging can be complex</w:t>
-      </w:r>
-    </w:p>
-    <w:p>
-      <w:pPr>
-        <w:spacing w:before="240" w:after="60" w:line="240" w:lineRule="auto"/>
-        <w:outlineLvl w:val="2"/>
-        <w:rPr>
-          <w:rFonts w:ascii="Times New Roman" w:eastAsia="Times New Roman" w:hAnsi="Times New Roman" w:cs="Times New Roman"/>
-          <w:b/>
-          <w:bCs/>
-          <w:color w:val="0D0D0D"/>
-          <w:sz w:val="24"/>
-          <w:szCs w:val="24"/>
-        </w:rPr>
-      </w:pPr>
-      <w:r>
-        <w:rPr>
-          <w:rFonts w:ascii="Times New Roman" w:eastAsia="Times New Roman" w:hAnsi="Times New Roman" w:cs="Times New Roman"/>
-          <w:b/>
-          <w:bCs/>
-          <w:color w:val="0D0D0D"/>
-          <w:sz w:val="24"/>
-          <w:szCs w:val="24"/>
-        </w:rPr>
-        <w:t>Examples:</w:t>
-      </w:r>
-    </w:p>
-    <w:p>
-      <w:pPr>
-        <w:numPr>
-          <w:ilvl w:val="0"/>
-          <w:numId w:val="15"/>
-        </w:numPr>
-        <w:spacing w:line="390" w:lineRule="atLeast"/>
-        <w:ind w:left="360"/>
-        <w:rPr>
-          <w:rFonts w:ascii="Times New Roman" w:eastAsia="Times New Roman" w:hAnsi="Times New Roman" w:cs="Times New Roman"/>
-          <w:color w:val="0D0D0D"/>
-          <w:sz w:val="24"/>
-          <w:szCs w:val="24"/>
-        </w:rPr>
-      </w:pPr>
-      <w:r>
-        <w:rPr>
-          <w:rFonts w:ascii="Times New Roman" w:eastAsia="Times New Roman" w:hAnsi="Times New Roman" w:cs="Times New Roman"/>
-          <w:color w:val="0D0D0D"/>
-          <w:sz w:val="24"/>
-          <w:szCs w:val="24"/>
-        </w:rPr>
-        <w:t>Uber Eats</w:t>
-      </w:r>
-    </w:p>
-    <w:p>
-      <w:pPr>
-        <w:numPr>
-          <w:ilvl w:val="0"/>
-          <w:numId w:val="15"/>
-        </w:numPr>
-        <w:spacing w:line="390" w:lineRule="atLeast"/>
-        <w:ind w:left="360"/>
-        <w:rPr>
-          <w:rFonts w:ascii="Times New Roman" w:eastAsia="Times New Roman" w:hAnsi="Times New Roman" w:cs="Times New Roman"/>
-          <w:color w:val="0D0D0D"/>
-          <w:sz w:val="24"/>
-          <w:szCs w:val="24"/>
-        </w:rPr>
-      </w:pPr>
-      <w:r>
-        <w:rPr>
-          <w:rFonts w:ascii="Times New Roman" w:eastAsia="Times New Roman" w:hAnsi="Times New Roman" w:cs="Times New Roman"/>
-          <w:color w:val="0D0D0D"/>
-          <w:sz w:val="24"/>
-          <w:szCs w:val="24"/>
-        </w:rPr>
-        <w:t>Discord</w:t>
-      </w:r>
-    </w:p>
-    <w:p>
-      <w:pPr>
-        <w:numPr>
-          <w:ilvl w:val="0"/>
-          <w:numId w:val="15"/>
-        </w:numPr>
-        <w:spacing w:line="390" w:lineRule="atLeast"/>
-        <w:ind w:left="360"/>
-        <w:rPr>
-          <w:rFonts w:ascii="Times New Roman" w:eastAsia="Times New Roman" w:hAnsi="Times New Roman" w:cs="Times New Roman"/>
-          <w:color w:val="0D0D0D"/>
-          <w:sz w:val="24"/>
-          <w:szCs w:val="24"/>
-        </w:rPr>
-      </w:pPr>
-      <w:r>
-        <w:rPr>
-          <w:rFonts w:ascii="Times New Roman" w:eastAsia="Times New Roman" w:hAnsi="Times New Roman" w:cs="Times New Roman"/>
-          <w:color w:val="0D0D0D"/>
-          <w:sz w:val="24"/>
-          <w:szCs w:val="24"/>
-        </w:rPr>
-        <w:t>Skype</w:t>
-      </w:r>
-    </w:p>
-    <w:p>
-      <w:pPr>
-        <w:pStyle w:val="Heading2"/>
-      </w:pPr>
-      <w:r>
-        <w:t>2.Mobile App Programming Language</w:t>
+      </w:pPr>
+      <w:r>
+        <w:t>Mobile App Programming Language</w:t>
       </w:r>
     </w:p>
     <w:p>
@@ -3090,161 +2016,85 @@
     <w:p>
       <w:pPr>
         <w:pStyle w:val="NormalWeb"/>
-        <w:spacing w:after="0" w:afterAutospacing="0" w:line="360" w:lineRule="auto"/>
-      </w:pPr>
-      <w:r>
-        <w:t>Examples include:</w:t>
+        <w:spacing w:line="360" w:lineRule="auto"/>
+        <w:jc w:val="both"/>
+      </w:pPr>
+      <w:r>
+        <w:t xml:space="preserve">The programming language choice is highly dependent on the platform for which the mobile application system is intended for use. There are 3 standard ecosystems which are considered when choosing the mobile programming language: the Android ecosystem, the iOS ecosystem and Cross-platform applications. </w:t>
       </w:r>
     </w:p>
     <w:p>
       <w:pPr>
         <w:pStyle w:val="NormalWeb"/>
-        <w:spacing w:before="0" w:beforeAutospacing="0" w:after="0" w:afterAutospacing="0" w:line="360" w:lineRule="auto"/>
-      </w:pPr>
-      <w:r>
-        <w:t>Java:</w:t>
-      </w:r>
-      <w:r>
-        <w:br/>
-        <w:t>Used for Android development.</w:t>
-      </w:r>
-    </w:p>
-    <w:p>
-      <w:pPr>
-        <w:pStyle w:val="NormalWeb"/>
-        <w:spacing w:after="0" w:afterAutospacing="0" w:line="360" w:lineRule="auto"/>
-      </w:pPr>
-      <w:r>
-        <w:t>Kotlin:</w:t>
-      </w:r>
-      <w:r>
-        <w:br/>
-        <w:t>Modern Android development language</w:t>
-      </w:r>
-    </w:p>
-    <w:p>
-      <w:pPr>
+        <w:numPr>
+          <w:ilvl w:val="0"/>
+          <w:numId w:val="58"/>
+        </w:numPr>
         <w:spacing w:line="360" w:lineRule="auto"/>
-        <w:rPr>
-          <w:rFonts w:ascii="Times New Roman" w:eastAsia="Times New Roman" w:hAnsi="Times New Roman" w:cs="Times New Roman"/>
-          <w:color w:val="0D0D0D"/>
-          <w:sz w:val="24"/>
-          <w:szCs w:val="24"/>
-        </w:rPr>
-      </w:pPr>
-      <w:r>
-        <w:rPr>
-          <w:rFonts w:ascii="Times New Roman" w:eastAsia="Times New Roman" w:hAnsi="Times New Roman" w:cs="Times New Roman"/>
-          <w:color w:val="0D0D0D"/>
-          <w:sz w:val="24"/>
-          <w:szCs w:val="24"/>
-        </w:rPr>
-        <w:lastRenderedPageBreak/>
-        <w:t>Used mainly for Android development.</w:t>
-      </w:r>
-    </w:p>
-    <w:p>
-      <w:pPr>
-        <w:spacing w:after="100" w:afterAutospacing="1" w:line="390" w:lineRule="atLeast"/>
-        <w:rPr>
-          <w:rFonts w:ascii="Times New Roman" w:eastAsia="Times New Roman" w:hAnsi="Times New Roman" w:cs="Times New Roman"/>
+        <w:jc w:val="both"/>
+        <w:rPr>
           <w:b/>
           <w:bCs/>
-          <w:color w:val="0D0D0D"/>
-          <w:sz w:val="24"/>
-          <w:szCs w:val="24"/>
-        </w:rPr>
-      </w:pPr>
-      <w:r>
-        <w:rPr>
-          <w:rFonts w:ascii="Times New Roman" w:eastAsia="Times New Roman" w:hAnsi="Times New Roman" w:cs="Times New Roman"/>
+        </w:rPr>
+      </w:pPr>
+      <w:r>
+        <w:rPr>
           <w:b/>
           <w:bCs/>
-          <w:color w:val="0D0D0D"/>
-          <w:sz w:val="24"/>
-          <w:szCs w:val="24"/>
-        </w:rPr>
-        <w:t>Advantages:</w:t>
-      </w:r>
-    </w:p>
-    <w:p>
-      <w:pPr>
+        </w:rPr>
+        <w:t xml:space="preserve">Android Ecosystem (Kotlin and Java): </w:t>
+      </w:r>
+    </w:p>
+    <w:p>
+      <w:pPr>
+        <w:pStyle w:val="NormalWeb"/>
+        <w:spacing w:line="360" w:lineRule="auto"/>
+        <w:jc w:val="both"/>
+      </w:pPr>
+      <w:r>
+        <w:t>Kotlin over the years has become the modern industry standard for app development for the Android ecosystem. This is mainly due to its modern syntax, built-in safety mechanisms and deep integration with the latest Android tools. Java on the other hand still remains a robust legacy option with a large community for support and high stability.</w:t>
+      </w:r>
+    </w:p>
+    <w:p>
+      <w:pPr>
+        <w:pStyle w:val="NormalWeb"/>
         <w:numPr>
           <w:ilvl w:val="0"/>
-          <w:numId w:val="16"/>
+          <w:numId w:val="58"/>
+        </w:numPr>
+        <w:spacing w:line="360" w:lineRule="auto"/>
+        <w:jc w:val="both"/>
+        <w:rPr>
+          <w:b/>
+          <w:bCs/>
+        </w:rPr>
+      </w:pPr>
+      <w:r>
+        <w:rPr>
+          <w:b/>
+          <w:bCs/>
+        </w:rPr>
+        <w:t>iOS Ecosystem (Swift and Objective-C):</w:t>
+      </w:r>
+    </w:p>
+    <w:p>
+      <w:pPr>
+        <w:pStyle w:val="NormalWeb"/>
+        <w:spacing w:line="360" w:lineRule="auto"/>
+        <w:jc w:val="both"/>
+      </w:pPr>
+      <w:r>
+        <w:t>Swift is the primary choice for modern iOS development as it offers high-speed execution and a safe syntax that prevents common coding errors. Objective-C is still used for maintaining older legacy systems.</w:t>
+      </w:r>
+    </w:p>
+    <w:p>
+      <w:pPr>
+        <w:pStyle w:val="ListParagraph"/>
+        <w:numPr>
+          <w:ilvl w:val="0"/>
+          <w:numId w:val="58"/>
         </w:numPr>
         <w:spacing w:line="390" w:lineRule="atLeast"/>
-        <w:ind w:left="360"/>
-        <w:rPr>
-          <w:rFonts w:ascii="Times New Roman" w:eastAsia="Times New Roman" w:hAnsi="Times New Roman" w:cs="Times New Roman"/>
-          <w:color w:val="0D0D0D"/>
-          <w:sz w:val="24"/>
-          <w:szCs w:val="24"/>
-        </w:rPr>
-      </w:pPr>
-      <w:r>
-        <w:rPr>
-          <w:rFonts w:ascii="Times New Roman" w:eastAsia="Times New Roman" w:hAnsi="Times New Roman" w:cs="Times New Roman"/>
-          <w:color w:val="0D0D0D"/>
-          <w:sz w:val="24"/>
-          <w:szCs w:val="24"/>
-        </w:rPr>
-        <w:t>Mature language</w:t>
-      </w:r>
-    </w:p>
-    <w:p>
-      <w:pPr>
-        <w:numPr>
-          <w:ilvl w:val="0"/>
-          <w:numId w:val="16"/>
-        </w:numPr>
-        <w:spacing w:line="390" w:lineRule="atLeast"/>
-        <w:ind w:left="360"/>
-        <w:rPr>
-          <w:rFonts w:ascii="Times New Roman" w:eastAsia="Times New Roman" w:hAnsi="Times New Roman" w:cs="Times New Roman"/>
-          <w:color w:val="0D0D0D"/>
-          <w:sz w:val="24"/>
-          <w:szCs w:val="24"/>
-        </w:rPr>
-      </w:pPr>
-      <w:r>
-        <w:rPr>
-          <w:rFonts w:ascii="Times New Roman" w:eastAsia="Times New Roman" w:hAnsi="Times New Roman" w:cs="Times New Roman"/>
-          <w:color w:val="0D0D0D"/>
-          <w:sz w:val="24"/>
-          <w:szCs w:val="24"/>
-        </w:rPr>
-        <w:t>Large community</w:t>
-      </w:r>
-    </w:p>
-    <w:p>
-      <w:pPr>
-        <w:numPr>
-          <w:ilvl w:val="0"/>
-          <w:numId w:val="16"/>
-        </w:numPr>
-        <w:spacing w:line="390" w:lineRule="atLeast"/>
-        <w:ind w:left="360"/>
-        <w:rPr>
-          <w:rFonts w:ascii="Times New Roman" w:eastAsia="Times New Roman" w:hAnsi="Times New Roman" w:cs="Times New Roman"/>
-          <w:color w:val="0D0D0D"/>
-          <w:sz w:val="24"/>
-          <w:szCs w:val="24"/>
-        </w:rPr>
-      </w:pPr>
-      <w:r>
-        <w:rPr>
-          <w:rFonts w:ascii="Times New Roman" w:eastAsia="Times New Roman" w:hAnsi="Times New Roman" w:cs="Times New Roman"/>
-          <w:color w:val="0D0D0D"/>
-          <w:sz w:val="24"/>
-          <w:szCs w:val="24"/>
-        </w:rPr>
-        <w:t>Stable</w:t>
-      </w:r>
-    </w:p>
-    <w:p>
-      <w:pPr>
-        <w:spacing w:after="100" w:afterAutospacing="1" w:line="390" w:lineRule="atLeast"/>
         <w:rPr>
           <w:rFonts w:ascii="Times New Roman" w:eastAsia="Times New Roman" w:hAnsi="Times New Roman" w:cs="Times New Roman"/>
           <w:b/>
@@ -3263,936 +2113,83 @@
           <w:sz w:val="24"/>
           <w:szCs w:val="24"/>
         </w:rPr>
-        <w:t>Disadvantages:</w:t>
-      </w:r>
-    </w:p>
-    <w:p>
-      <w:pPr>
-        <w:numPr>
-          <w:ilvl w:val="0"/>
-          <w:numId w:val="17"/>
-        </w:numPr>
+        <w:t>Cross-Platform (Dart &amp; JavaScript):</w:t>
+      </w:r>
+    </w:p>
+    <w:p>
+      <w:pPr>
         <w:spacing w:line="390" w:lineRule="atLeast"/>
-        <w:ind w:left="360"/>
-        <w:rPr>
-          <w:rFonts w:ascii="Times New Roman" w:eastAsia="Times New Roman" w:hAnsi="Times New Roman" w:cs="Times New Roman"/>
-          <w:color w:val="0D0D0D"/>
-          <w:sz w:val="24"/>
-          <w:szCs w:val="24"/>
-        </w:rPr>
-      </w:pPr>
-      <w:r>
-        <w:rPr>
-          <w:rFonts w:ascii="Times New Roman" w:eastAsia="Times New Roman" w:hAnsi="Times New Roman" w:cs="Times New Roman"/>
-          <w:color w:val="0D0D0D"/>
-          <w:sz w:val="24"/>
-          <w:szCs w:val="24"/>
-        </w:rPr>
-        <w:t>More verbose</w:t>
-      </w:r>
-    </w:p>
-    <w:p>
-      <w:pPr>
-        <w:numPr>
-          <w:ilvl w:val="0"/>
-          <w:numId w:val="17"/>
-        </w:numPr>
+        <w:rPr>
+          <w:rFonts w:ascii="Times New Roman" w:eastAsia="Times New Roman" w:hAnsi="Times New Roman" w:cs="Times New Roman"/>
+          <w:color w:val="0D0D0D"/>
+          <w:sz w:val="24"/>
+          <w:szCs w:val="24"/>
+        </w:rPr>
+      </w:pPr>
+      <w:r>
+        <w:rPr>
+          <w:rFonts w:ascii="Times New Roman" w:eastAsia="Times New Roman" w:hAnsi="Times New Roman" w:cs="Times New Roman"/>
+          <w:color w:val="0D0D0D"/>
+          <w:sz w:val="24"/>
+          <w:szCs w:val="24"/>
+        </w:rPr>
+        <w:lastRenderedPageBreak/>
+        <w:t>JavaScript is the most versatile language as it powers React Native and PWAs due to its large developer ecosystem. Dart on the other hand is optimized for high-speed UI rendering in Flutter, allowing for development using modern technologies like Hot Reload</w:t>
+      </w:r>
+    </w:p>
+    <w:p>
+      <w:pPr>
         <w:spacing w:line="390" w:lineRule="atLeast"/>
-        <w:ind w:left="360"/>
-        <w:rPr>
-          <w:rFonts w:ascii="Times New Roman" w:eastAsia="Times New Roman" w:hAnsi="Times New Roman" w:cs="Times New Roman"/>
-          <w:color w:val="0D0D0D"/>
-          <w:sz w:val="24"/>
-          <w:szCs w:val="24"/>
-        </w:rPr>
-      </w:pPr>
-      <w:r>
-        <w:rPr>
-          <w:rFonts w:ascii="Times New Roman" w:eastAsia="Times New Roman" w:hAnsi="Times New Roman" w:cs="Times New Roman"/>
-          <w:color w:val="0D0D0D"/>
-          <w:sz w:val="24"/>
-          <w:szCs w:val="24"/>
-        </w:rPr>
-        <w:t>Slower than Kotlin</w:t>
-      </w:r>
-    </w:p>
-    <w:p>
-      <w:pPr>
-        <w:spacing w:after="60" w:line="240" w:lineRule="auto"/>
-        <w:outlineLvl w:val="1"/>
-        <w:rPr>
-          <w:rFonts w:ascii="Times New Roman" w:eastAsia="Times New Roman" w:hAnsi="Times New Roman" w:cs="Times New Roman"/>
-          <w:color w:val="0D0D0D"/>
-          <w:sz w:val="24"/>
-          <w:szCs w:val="24"/>
-        </w:rPr>
-      </w:pPr>
-    </w:p>
-    <w:p>
-      <w:pPr>
-        <w:spacing w:after="60" w:line="240" w:lineRule="auto"/>
-        <w:outlineLvl w:val="1"/>
+        <w:rPr>
+          <w:rFonts w:ascii="Times New Roman" w:eastAsia="Times New Roman" w:hAnsi="Times New Roman" w:cs="Times New Roman"/>
+          <w:color w:val="0D0D0D"/>
+          <w:sz w:val="24"/>
+          <w:szCs w:val="24"/>
+        </w:rPr>
+      </w:pPr>
+    </w:p>
+    <w:p>
+      <w:pPr>
+        <w:pStyle w:val="Heading2"/>
+      </w:pPr>
+      <w:r>
+        <w:t>3. Mobile Development Frameworks</w:t>
+      </w:r>
+    </w:p>
+    <w:p>
+      <w:pPr>
+        <w:spacing w:line="360" w:lineRule="auto"/>
+        <w:rPr>
+          <w:rFonts w:ascii="Times New Roman" w:eastAsia="Times New Roman" w:hAnsi="Times New Roman" w:cs="Times New Roman"/>
+          <w:sz w:val="24"/>
+          <w:szCs w:val="24"/>
+        </w:rPr>
+      </w:pPr>
+      <w:r>
+        <w:rPr>
+          <w:rFonts w:ascii="Times New Roman" w:eastAsia="Times New Roman" w:hAnsi="Times New Roman" w:cs="Times New Roman"/>
+          <w:sz w:val="24"/>
+          <w:szCs w:val="24"/>
+        </w:rPr>
+        <w:t xml:space="preserve">A </w:t>
+      </w:r>
+      <w:r>
         <w:rPr>
           <w:rFonts w:ascii="Times New Roman" w:eastAsia="Times New Roman" w:hAnsi="Times New Roman" w:cs="Times New Roman"/>
           <w:b/>
           <w:bCs/>
-          <w:color w:val="0D0D0D"/>
-          <w:sz w:val="24"/>
-          <w:szCs w:val="24"/>
-        </w:rPr>
-      </w:pPr>
-      <w:r>
-        <w:rPr>
-          <w:rFonts w:ascii="Times New Roman" w:eastAsia="Times New Roman" w:hAnsi="Times New Roman" w:cs="Times New Roman"/>
-          <w:b/>
-          <w:bCs/>
-          <w:color w:val="0D0D0D"/>
-          <w:sz w:val="24"/>
-          <w:szCs w:val="24"/>
-        </w:rPr>
-        <w:t>Kotlin</w:t>
-      </w:r>
-    </w:p>
-    <w:p>
-      <w:pPr>
-        <w:spacing w:after="100" w:afterAutospacing="1" w:line="390" w:lineRule="atLeast"/>
-        <w:rPr>
-          <w:rFonts w:ascii="Times New Roman" w:eastAsia="Times New Roman" w:hAnsi="Times New Roman" w:cs="Times New Roman"/>
-          <w:color w:val="0D0D0D"/>
-          <w:sz w:val="24"/>
-          <w:szCs w:val="24"/>
-        </w:rPr>
-      </w:pPr>
-      <w:r>
-        <w:rPr>
-          <w:rFonts w:ascii="Times New Roman" w:eastAsia="Times New Roman" w:hAnsi="Times New Roman" w:cs="Times New Roman"/>
-          <w:color w:val="0D0D0D"/>
-          <w:sz w:val="24"/>
-          <w:szCs w:val="24"/>
-        </w:rPr>
-        <w:t>Modern Android language.</w:t>
-      </w:r>
-    </w:p>
-    <w:p>
-      <w:pPr>
-        <w:spacing w:after="100" w:afterAutospacing="1" w:line="390" w:lineRule="atLeast"/>
-        <w:rPr>
-          <w:rFonts w:ascii="Times New Roman" w:eastAsia="Times New Roman" w:hAnsi="Times New Roman" w:cs="Times New Roman"/>
-          <w:b/>
-          <w:bCs/>
-          <w:color w:val="0D0D0D"/>
-          <w:sz w:val="24"/>
-          <w:szCs w:val="24"/>
-        </w:rPr>
-      </w:pPr>
-      <w:r>
-        <w:rPr>
-          <w:rFonts w:ascii="Times New Roman" w:eastAsia="Times New Roman" w:hAnsi="Times New Roman" w:cs="Times New Roman"/>
-          <w:b/>
-          <w:bCs/>
-          <w:color w:val="0D0D0D"/>
-          <w:sz w:val="24"/>
-          <w:szCs w:val="24"/>
-        </w:rPr>
-        <w:t>Advantages:</w:t>
-      </w:r>
-    </w:p>
-    <w:p>
-      <w:pPr>
-        <w:numPr>
-          <w:ilvl w:val="0"/>
-          <w:numId w:val="18"/>
-        </w:numPr>
-        <w:spacing w:line="390" w:lineRule="atLeast"/>
-        <w:ind w:left="360"/>
-        <w:rPr>
-          <w:rFonts w:ascii="Times New Roman" w:eastAsia="Times New Roman" w:hAnsi="Times New Roman" w:cs="Times New Roman"/>
-          <w:color w:val="0D0D0D"/>
-          <w:sz w:val="24"/>
-          <w:szCs w:val="24"/>
-        </w:rPr>
-      </w:pPr>
-      <w:r>
-        <w:rPr>
-          <w:rFonts w:ascii="Times New Roman" w:eastAsia="Times New Roman" w:hAnsi="Times New Roman" w:cs="Times New Roman"/>
-          <w:color w:val="0D0D0D"/>
-          <w:sz w:val="24"/>
-          <w:szCs w:val="24"/>
-        </w:rPr>
-        <w:t>Concise code</w:t>
-      </w:r>
-    </w:p>
-    <w:p>
-      <w:pPr>
-        <w:numPr>
-          <w:ilvl w:val="0"/>
-          <w:numId w:val="18"/>
-        </w:numPr>
-        <w:spacing w:line="390" w:lineRule="atLeast"/>
-        <w:ind w:left="360"/>
-        <w:rPr>
-          <w:rFonts w:ascii="Times New Roman" w:eastAsia="Times New Roman" w:hAnsi="Times New Roman" w:cs="Times New Roman"/>
-          <w:color w:val="0D0D0D"/>
-          <w:sz w:val="24"/>
-          <w:szCs w:val="24"/>
-        </w:rPr>
-      </w:pPr>
-      <w:r>
-        <w:rPr>
-          <w:rFonts w:ascii="Times New Roman" w:eastAsia="Times New Roman" w:hAnsi="Times New Roman" w:cs="Times New Roman"/>
-          <w:color w:val="0D0D0D"/>
-          <w:sz w:val="24"/>
-          <w:szCs w:val="24"/>
-        </w:rPr>
-        <w:t>Null safety</w:t>
-      </w:r>
-    </w:p>
-    <w:p>
-      <w:pPr>
-        <w:numPr>
-          <w:ilvl w:val="0"/>
-          <w:numId w:val="18"/>
-        </w:numPr>
-        <w:spacing w:line="390" w:lineRule="atLeast"/>
-        <w:ind w:left="360"/>
-        <w:rPr>
-          <w:rFonts w:ascii="Times New Roman" w:eastAsia="Times New Roman" w:hAnsi="Times New Roman" w:cs="Times New Roman"/>
-          <w:color w:val="0D0D0D"/>
-          <w:sz w:val="24"/>
-          <w:szCs w:val="24"/>
-        </w:rPr>
-      </w:pPr>
-      <w:r>
-        <w:rPr>
-          <w:rFonts w:ascii="Times New Roman" w:eastAsia="Times New Roman" w:hAnsi="Times New Roman" w:cs="Times New Roman"/>
-          <w:color w:val="0D0D0D"/>
-          <w:sz w:val="24"/>
-          <w:szCs w:val="24"/>
-        </w:rPr>
-        <w:t>Official Android language</w:t>
-      </w:r>
-    </w:p>
-    <w:p>
-      <w:pPr>
-        <w:spacing w:after="100" w:afterAutospacing="1" w:line="390" w:lineRule="atLeast"/>
-        <w:rPr>
-          <w:rFonts w:ascii="Times New Roman" w:eastAsia="Times New Roman" w:hAnsi="Times New Roman" w:cs="Times New Roman"/>
-          <w:b/>
-          <w:bCs/>
-          <w:color w:val="0D0D0D"/>
-          <w:sz w:val="24"/>
-          <w:szCs w:val="24"/>
-        </w:rPr>
-      </w:pPr>
-      <w:r>
-        <w:rPr>
-          <w:rFonts w:ascii="Times New Roman" w:eastAsia="Times New Roman" w:hAnsi="Times New Roman" w:cs="Times New Roman"/>
-          <w:b/>
-          <w:bCs/>
-          <w:color w:val="0D0D0D"/>
-          <w:sz w:val="24"/>
-          <w:szCs w:val="24"/>
-        </w:rPr>
-        <w:t>Disadvantages:</w:t>
-      </w:r>
-    </w:p>
-    <w:p>
-      <w:pPr>
-        <w:numPr>
-          <w:ilvl w:val="0"/>
-          <w:numId w:val="19"/>
-        </w:numPr>
-        <w:spacing w:line="390" w:lineRule="atLeast"/>
-        <w:ind w:left="360"/>
-        <w:rPr>
-          <w:rFonts w:ascii="Times New Roman" w:eastAsia="Times New Roman" w:hAnsi="Times New Roman" w:cs="Times New Roman"/>
-          <w:color w:val="0D0D0D"/>
-          <w:sz w:val="24"/>
-          <w:szCs w:val="24"/>
-        </w:rPr>
-      </w:pPr>
-      <w:r>
-        <w:rPr>
-          <w:rFonts w:ascii="Times New Roman" w:eastAsia="Times New Roman" w:hAnsi="Times New Roman" w:cs="Times New Roman"/>
-          <w:color w:val="0D0D0D"/>
-          <w:sz w:val="24"/>
-          <w:szCs w:val="24"/>
-        </w:rPr>
-        <w:t>Steep l</w:t>
-      </w:r>
-      <w:r>
-        <w:rPr>
-          <w:rFonts w:ascii="Times New Roman" w:eastAsia="Times New Roman" w:hAnsi="Times New Roman" w:cs="Times New Roman"/>
-          <w:color w:val="0D0D0D"/>
-          <w:sz w:val="24"/>
-          <w:szCs w:val="24"/>
-        </w:rPr>
-        <w:t>earning curve</w:t>
-      </w:r>
-    </w:p>
-    <w:p>
-      <w:pPr>
-        <w:spacing w:line="390" w:lineRule="atLeast"/>
-        <w:rPr>
-          <w:rFonts w:ascii="Times New Roman" w:eastAsia="Times New Roman" w:hAnsi="Times New Roman" w:cs="Times New Roman"/>
-          <w:color w:val="0D0D0D"/>
-          <w:sz w:val="24"/>
-          <w:szCs w:val="24"/>
-        </w:rPr>
-      </w:pPr>
-    </w:p>
-    <w:p>
-      <w:pPr>
-        <w:spacing w:after="60" w:line="240" w:lineRule="auto"/>
-        <w:outlineLvl w:val="1"/>
-        <w:rPr>
-          <w:rFonts w:ascii="Times New Roman" w:eastAsia="Times New Roman" w:hAnsi="Times New Roman" w:cs="Times New Roman"/>
-          <w:b/>
-          <w:bCs/>
-          <w:color w:val="0D0D0D"/>
-          <w:sz w:val="24"/>
-          <w:szCs w:val="24"/>
-        </w:rPr>
-      </w:pPr>
-      <w:r>
-        <w:rPr>
-          <w:rFonts w:ascii="Times New Roman" w:eastAsia="Times New Roman" w:hAnsi="Times New Roman" w:cs="Times New Roman"/>
-          <w:b/>
-          <w:bCs/>
-          <w:color w:val="0D0D0D"/>
-          <w:sz w:val="24"/>
-          <w:szCs w:val="24"/>
-        </w:rPr>
-        <w:t>Swift</w:t>
-      </w:r>
-      <w:r>
-        <w:rPr>
-          <w:rFonts w:ascii="Times New Roman" w:eastAsia="Times New Roman" w:hAnsi="Times New Roman" w:cs="Times New Roman"/>
-          <w:b/>
-          <w:bCs/>
-          <w:color w:val="0D0D0D"/>
-          <w:sz w:val="24"/>
-          <w:szCs w:val="24"/>
-        </w:rPr>
-        <w:t>:</w:t>
-      </w:r>
-      <w:r>
-        <w:rPr>
-          <w:rFonts w:ascii="Times New Roman" w:eastAsia="Times New Roman" w:hAnsi="Times New Roman" w:cs="Times New Roman"/>
-          <w:b/>
-          <w:bCs/>
-          <w:color w:val="0D0D0D"/>
-          <w:sz w:val="24"/>
-          <w:szCs w:val="24"/>
-        </w:rPr>
-        <w:t xml:space="preserve"> </w:t>
-      </w:r>
-      <w:r>
-        <w:rPr>
-          <w:rFonts w:ascii="Times New Roman" w:eastAsia="Times New Roman" w:hAnsi="Times New Roman" w:cs="Times New Roman"/>
-          <w:color w:val="0D0D0D"/>
-          <w:sz w:val="24"/>
-          <w:szCs w:val="24"/>
-        </w:rPr>
-        <w:t>Used for iOS development.</w:t>
-      </w:r>
-    </w:p>
-    <w:p>
-      <w:pPr>
-        <w:spacing w:after="100" w:afterAutospacing="1" w:line="390" w:lineRule="atLeast"/>
-        <w:rPr>
-          <w:rFonts w:ascii="Times New Roman" w:eastAsia="Times New Roman" w:hAnsi="Times New Roman" w:cs="Times New Roman"/>
-          <w:b/>
-          <w:bCs/>
-          <w:color w:val="0D0D0D"/>
-          <w:sz w:val="24"/>
-          <w:szCs w:val="24"/>
-        </w:rPr>
-      </w:pPr>
-      <w:r>
-        <w:rPr>
-          <w:rFonts w:ascii="Times New Roman" w:eastAsia="Times New Roman" w:hAnsi="Times New Roman" w:cs="Times New Roman"/>
-          <w:b/>
-          <w:bCs/>
-          <w:color w:val="0D0D0D"/>
-          <w:sz w:val="24"/>
-          <w:szCs w:val="24"/>
-        </w:rPr>
-        <w:t>Advantages:</w:t>
-      </w:r>
-    </w:p>
-    <w:p>
-      <w:pPr>
-        <w:numPr>
-          <w:ilvl w:val="0"/>
-          <w:numId w:val="20"/>
-        </w:numPr>
-        <w:spacing w:line="390" w:lineRule="atLeast"/>
-        <w:ind w:left="360"/>
-        <w:rPr>
-          <w:rFonts w:ascii="Times New Roman" w:eastAsia="Times New Roman" w:hAnsi="Times New Roman" w:cs="Times New Roman"/>
-          <w:color w:val="0D0D0D"/>
-          <w:sz w:val="24"/>
-          <w:szCs w:val="24"/>
-        </w:rPr>
-      </w:pPr>
-      <w:r>
-        <w:rPr>
-          <w:rFonts w:ascii="Times New Roman" w:eastAsia="Times New Roman" w:hAnsi="Times New Roman" w:cs="Times New Roman"/>
-          <w:color w:val="0D0D0D"/>
-          <w:sz w:val="24"/>
-          <w:szCs w:val="24"/>
-        </w:rPr>
-        <w:t>Fast</w:t>
-      </w:r>
-    </w:p>
-    <w:p>
-      <w:pPr>
-        <w:numPr>
-          <w:ilvl w:val="0"/>
-          <w:numId w:val="20"/>
-        </w:numPr>
-        <w:spacing w:line="390" w:lineRule="atLeast"/>
-        <w:ind w:left="360"/>
-        <w:rPr>
-          <w:rFonts w:ascii="Times New Roman" w:eastAsia="Times New Roman" w:hAnsi="Times New Roman" w:cs="Times New Roman"/>
-          <w:color w:val="0D0D0D"/>
-          <w:sz w:val="24"/>
-          <w:szCs w:val="24"/>
-        </w:rPr>
-      </w:pPr>
-      <w:r>
-        <w:rPr>
-          <w:rFonts w:ascii="Times New Roman" w:eastAsia="Times New Roman" w:hAnsi="Times New Roman" w:cs="Times New Roman"/>
-          <w:color w:val="0D0D0D"/>
-          <w:sz w:val="24"/>
-          <w:szCs w:val="24"/>
-        </w:rPr>
-        <w:t>Safe</w:t>
-      </w:r>
-    </w:p>
-    <w:p>
-      <w:pPr>
-        <w:numPr>
-          <w:ilvl w:val="0"/>
-          <w:numId w:val="20"/>
-        </w:numPr>
-        <w:spacing w:line="390" w:lineRule="atLeast"/>
-        <w:ind w:left="360"/>
-        <w:rPr>
-          <w:rFonts w:ascii="Times New Roman" w:eastAsia="Times New Roman" w:hAnsi="Times New Roman" w:cs="Times New Roman"/>
-          <w:color w:val="0D0D0D"/>
-          <w:sz w:val="24"/>
-          <w:szCs w:val="24"/>
-        </w:rPr>
-      </w:pPr>
-      <w:r>
-        <w:rPr>
-          <w:rFonts w:ascii="Times New Roman" w:eastAsia="Times New Roman" w:hAnsi="Times New Roman" w:cs="Times New Roman"/>
-          <w:color w:val="0D0D0D"/>
-          <w:sz w:val="24"/>
-          <w:szCs w:val="24"/>
-        </w:rPr>
-        <w:t>Modern design</w:t>
-      </w:r>
-    </w:p>
-    <w:p>
-      <w:pPr>
-        <w:spacing w:after="100" w:afterAutospacing="1" w:line="390" w:lineRule="atLeast"/>
-        <w:rPr>
-          <w:rFonts w:ascii="Times New Roman" w:eastAsia="Times New Roman" w:hAnsi="Times New Roman" w:cs="Times New Roman"/>
-          <w:b/>
-          <w:bCs/>
-          <w:color w:val="0D0D0D"/>
-          <w:sz w:val="24"/>
-          <w:szCs w:val="24"/>
-        </w:rPr>
-      </w:pPr>
-      <w:r>
-        <w:rPr>
-          <w:rFonts w:ascii="Times New Roman" w:eastAsia="Times New Roman" w:hAnsi="Times New Roman" w:cs="Times New Roman"/>
-          <w:b/>
-          <w:bCs/>
-          <w:color w:val="0D0D0D"/>
-          <w:sz w:val="24"/>
-          <w:szCs w:val="24"/>
-        </w:rPr>
-        <w:lastRenderedPageBreak/>
-        <w:t>Disadvantages:</w:t>
-      </w:r>
-    </w:p>
-    <w:p>
-      <w:pPr>
-        <w:numPr>
-          <w:ilvl w:val="0"/>
-          <w:numId w:val="21"/>
-        </w:numPr>
-        <w:spacing w:line="390" w:lineRule="atLeast"/>
-        <w:ind w:left="360"/>
-        <w:rPr>
-          <w:rFonts w:ascii="Times New Roman" w:eastAsia="Times New Roman" w:hAnsi="Times New Roman" w:cs="Times New Roman"/>
-          <w:color w:val="0D0D0D"/>
-          <w:sz w:val="24"/>
-          <w:szCs w:val="24"/>
-        </w:rPr>
-      </w:pPr>
-      <w:r>
-        <w:rPr>
-          <w:rFonts w:ascii="Times New Roman" w:eastAsia="Times New Roman" w:hAnsi="Times New Roman" w:cs="Times New Roman"/>
-          <w:color w:val="0D0D0D"/>
-          <w:sz w:val="24"/>
-          <w:szCs w:val="24"/>
-        </w:rPr>
-        <w:t>Only for Apple ecosystem</w:t>
-      </w:r>
-    </w:p>
-    <w:p>
-      <w:pPr>
-        <w:spacing w:line="390" w:lineRule="atLeast"/>
-        <w:rPr>
-          <w:rFonts w:ascii="Times New Roman" w:eastAsia="Times New Roman" w:hAnsi="Times New Roman" w:cs="Times New Roman"/>
-          <w:color w:val="0D0D0D"/>
-          <w:sz w:val="24"/>
-          <w:szCs w:val="24"/>
-        </w:rPr>
-      </w:pPr>
-    </w:p>
-    <w:p>
-      <w:pPr>
-        <w:spacing w:after="60" w:line="240" w:lineRule="auto"/>
-        <w:outlineLvl w:val="1"/>
-        <w:rPr>
-          <w:rFonts w:ascii="Times New Roman" w:eastAsia="Times New Roman" w:hAnsi="Times New Roman" w:cs="Times New Roman"/>
-          <w:b/>
-          <w:bCs/>
-          <w:color w:val="0D0D0D"/>
-          <w:sz w:val="24"/>
-          <w:szCs w:val="24"/>
-        </w:rPr>
-      </w:pPr>
-      <w:r>
-        <w:rPr>
-          <w:rFonts w:ascii="Times New Roman" w:eastAsia="Times New Roman" w:hAnsi="Times New Roman" w:cs="Times New Roman"/>
-          <w:b/>
-          <w:bCs/>
-          <w:color w:val="0D0D0D"/>
-          <w:sz w:val="24"/>
-          <w:szCs w:val="24"/>
-        </w:rPr>
-        <w:t>JavaScript</w:t>
-      </w:r>
-      <w:r>
-        <w:rPr>
-          <w:rFonts w:ascii="Times New Roman" w:eastAsia="Times New Roman" w:hAnsi="Times New Roman" w:cs="Times New Roman"/>
-          <w:b/>
-          <w:bCs/>
-          <w:color w:val="0D0D0D"/>
-          <w:sz w:val="24"/>
-          <w:szCs w:val="24"/>
-        </w:rPr>
-        <w:t>:</w:t>
-      </w:r>
-      <w:r>
-        <w:rPr>
-          <w:rFonts w:ascii="Times New Roman" w:eastAsia="Times New Roman" w:hAnsi="Times New Roman" w:cs="Times New Roman"/>
-          <w:b/>
-          <w:bCs/>
-          <w:color w:val="0D0D0D"/>
-          <w:sz w:val="24"/>
-          <w:szCs w:val="24"/>
-        </w:rPr>
-        <w:t xml:space="preserve"> </w:t>
-      </w:r>
-      <w:r>
-        <w:rPr>
-          <w:rFonts w:ascii="Times New Roman" w:eastAsia="Times New Roman" w:hAnsi="Times New Roman" w:cs="Times New Roman"/>
-          <w:color w:val="0D0D0D"/>
-          <w:sz w:val="24"/>
-          <w:szCs w:val="24"/>
-        </w:rPr>
-        <w:t>Used in hybrid and PWA development.</w:t>
-      </w:r>
-    </w:p>
-    <w:p>
-      <w:pPr>
-        <w:spacing w:after="100" w:afterAutospacing="1" w:line="390" w:lineRule="atLeast"/>
-        <w:rPr>
-          <w:rFonts w:ascii="Times New Roman" w:eastAsia="Times New Roman" w:hAnsi="Times New Roman" w:cs="Times New Roman"/>
-          <w:b/>
-          <w:bCs/>
-          <w:color w:val="0D0D0D"/>
-          <w:sz w:val="24"/>
-          <w:szCs w:val="24"/>
-        </w:rPr>
-      </w:pPr>
-      <w:r>
-        <w:rPr>
-          <w:rFonts w:ascii="Times New Roman" w:eastAsia="Times New Roman" w:hAnsi="Times New Roman" w:cs="Times New Roman"/>
-          <w:b/>
-          <w:bCs/>
-          <w:color w:val="0D0D0D"/>
-          <w:sz w:val="24"/>
-          <w:szCs w:val="24"/>
-        </w:rPr>
-        <w:t>Advantages:</w:t>
-      </w:r>
-    </w:p>
-    <w:p>
-      <w:pPr>
-        <w:numPr>
-          <w:ilvl w:val="0"/>
-          <w:numId w:val="22"/>
-        </w:numPr>
-        <w:spacing w:line="390" w:lineRule="atLeast"/>
-        <w:ind w:left="0"/>
-        <w:rPr>
-          <w:rFonts w:ascii="Times New Roman" w:eastAsia="Times New Roman" w:hAnsi="Times New Roman" w:cs="Times New Roman"/>
-          <w:color w:val="0D0D0D"/>
-          <w:sz w:val="24"/>
-          <w:szCs w:val="24"/>
-        </w:rPr>
-      </w:pPr>
-      <w:r>
-        <w:rPr>
-          <w:rFonts w:ascii="Times New Roman" w:eastAsia="Times New Roman" w:hAnsi="Times New Roman" w:cs="Times New Roman"/>
-          <w:color w:val="0D0D0D"/>
-          <w:sz w:val="24"/>
-          <w:szCs w:val="24"/>
-        </w:rPr>
-        <w:t>Cross platform</w:t>
-      </w:r>
-    </w:p>
-    <w:p>
-      <w:pPr>
-        <w:numPr>
-          <w:ilvl w:val="0"/>
-          <w:numId w:val="22"/>
-        </w:numPr>
-        <w:spacing w:line="390" w:lineRule="atLeast"/>
-        <w:ind w:left="0"/>
-        <w:rPr>
-          <w:rFonts w:ascii="Times New Roman" w:eastAsia="Times New Roman" w:hAnsi="Times New Roman" w:cs="Times New Roman"/>
-          <w:color w:val="0D0D0D"/>
-          <w:sz w:val="24"/>
-          <w:szCs w:val="24"/>
-        </w:rPr>
-      </w:pPr>
-      <w:r>
-        <w:rPr>
-          <w:rFonts w:ascii="Times New Roman" w:eastAsia="Times New Roman" w:hAnsi="Times New Roman" w:cs="Times New Roman"/>
-          <w:color w:val="0D0D0D"/>
-          <w:sz w:val="24"/>
-          <w:szCs w:val="24"/>
-        </w:rPr>
-        <w:t>Large ecosystem</w:t>
-      </w:r>
-    </w:p>
-    <w:p>
-      <w:pPr>
-        <w:numPr>
-          <w:ilvl w:val="0"/>
-          <w:numId w:val="22"/>
-        </w:numPr>
-        <w:spacing w:line="390" w:lineRule="atLeast"/>
-        <w:ind w:left="0"/>
-        <w:rPr>
-          <w:rFonts w:ascii="Times New Roman" w:eastAsia="Times New Roman" w:hAnsi="Times New Roman" w:cs="Times New Roman"/>
-          <w:color w:val="0D0D0D"/>
-          <w:sz w:val="24"/>
-          <w:szCs w:val="24"/>
-        </w:rPr>
-      </w:pPr>
-      <w:r>
-        <w:rPr>
-          <w:rFonts w:ascii="Times New Roman" w:eastAsia="Times New Roman" w:hAnsi="Times New Roman" w:cs="Times New Roman"/>
-          <w:color w:val="0D0D0D"/>
-          <w:sz w:val="24"/>
-          <w:szCs w:val="24"/>
-        </w:rPr>
-        <w:t>Fast development</w:t>
-      </w:r>
-    </w:p>
-    <w:p>
-      <w:pPr>
-        <w:spacing w:after="100" w:afterAutospacing="1" w:line="390" w:lineRule="atLeast"/>
-        <w:rPr>
-          <w:rFonts w:ascii="Times New Roman" w:eastAsia="Times New Roman" w:hAnsi="Times New Roman" w:cs="Times New Roman"/>
-          <w:b/>
-          <w:bCs/>
-          <w:color w:val="0D0D0D"/>
-          <w:sz w:val="24"/>
-          <w:szCs w:val="24"/>
-        </w:rPr>
-      </w:pPr>
-      <w:r>
-        <w:rPr>
-          <w:rFonts w:ascii="Times New Roman" w:eastAsia="Times New Roman" w:hAnsi="Times New Roman" w:cs="Times New Roman"/>
-          <w:b/>
-          <w:bCs/>
-          <w:color w:val="0D0D0D"/>
-          <w:sz w:val="24"/>
-          <w:szCs w:val="24"/>
-        </w:rPr>
-        <w:t>Disadvantages:</w:t>
-      </w:r>
-    </w:p>
-    <w:p>
-      <w:pPr>
-        <w:numPr>
-          <w:ilvl w:val="0"/>
-          <w:numId w:val="23"/>
-        </w:numPr>
-        <w:spacing w:line="390" w:lineRule="atLeast"/>
-        <w:ind w:left="360"/>
-        <w:rPr>
-          <w:rFonts w:ascii="Times New Roman" w:eastAsia="Times New Roman" w:hAnsi="Times New Roman" w:cs="Times New Roman"/>
-          <w:color w:val="0D0D0D"/>
-          <w:sz w:val="24"/>
-          <w:szCs w:val="24"/>
-        </w:rPr>
-      </w:pPr>
-      <w:r>
-        <w:rPr>
-          <w:rFonts w:ascii="Times New Roman" w:eastAsia="Times New Roman" w:hAnsi="Times New Roman" w:cs="Times New Roman"/>
-          <w:color w:val="0D0D0D"/>
-          <w:sz w:val="24"/>
-          <w:szCs w:val="24"/>
-        </w:rPr>
-        <w:t>Performance lower than native</w:t>
-      </w:r>
-    </w:p>
-    <w:p>
-      <w:pPr>
-        <w:spacing w:line="390" w:lineRule="atLeast"/>
-        <w:rPr>
-          <w:rFonts w:ascii="Times New Roman" w:eastAsia="Times New Roman" w:hAnsi="Times New Roman" w:cs="Times New Roman"/>
-          <w:color w:val="0D0D0D"/>
-          <w:sz w:val="24"/>
-          <w:szCs w:val="24"/>
-        </w:rPr>
-      </w:pPr>
-    </w:p>
-    <w:p>
-      <w:pPr>
-        <w:spacing w:after="60" w:line="240" w:lineRule="auto"/>
-        <w:outlineLvl w:val="1"/>
-        <w:rPr>
-          <w:rFonts w:ascii="Times New Roman" w:eastAsia="Times New Roman" w:hAnsi="Times New Roman" w:cs="Times New Roman"/>
-          <w:b/>
-          <w:bCs/>
-          <w:color w:val="0D0D0D"/>
-          <w:sz w:val="24"/>
-          <w:szCs w:val="24"/>
-        </w:rPr>
-      </w:pPr>
-      <w:r>
-        <w:rPr>
-          <w:rFonts w:ascii="Times New Roman" w:eastAsia="Times New Roman" w:hAnsi="Times New Roman" w:cs="Times New Roman"/>
-          <w:b/>
-          <w:bCs/>
-          <w:color w:val="0D0D0D"/>
-          <w:sz w:val="24"/>
-          <w:szCs w:val="24"/>
-        </w:rPr>
-        <w:t>Dart</w:t>
-      </w:r>
-      <w:r>
-        <w:rPr>
-          <w:rFonts w:ascii="Times New Roman" w:eastAsia="Times New Roman" w:hAnsi="Times New Roman" w:cs="Times New Roman"/>
-          <w:b/>
-          <w:bCs/>
-          <w:color w:val="0D0D0D"/>
-          <w:sz w:val="24"/>
-          <w:szCs w:val="24"/>
-        </w:rPr>
-        <w:t>:</w:t>
-      </w:r>
-      <w:r>
-        <w:rPr>
-          <w:rFonts w:ascii="Times New Roman" w:eastAsia="Times New Roman" w:hAnsi="Times New Roman" w:cs="Times New Roman"/>
-          <w:b/>
-          <w:bCs/>
-          <w:color w:val="0D0D0D"/>
-          <w:sz w:val="24"/>
-          <w:szCs w:val="24"/>
-        </w:rPr>
-        <w:t xml:space="preserve"> </w:t>
-      </w:r>
-      <w:r>
-        <w:rPr>
-          <w:rFonts w:ascii="Times New Roman" w:eastAsia="Times New Roman" w:hAnsi="Times New Roman" w:cs="Times New Roman"/>
-          <w:color w:val="0D0D0D"/>
-          <w:sz w:val="24"/>
-          <w:szCs w:val="24"/>
-        </w:rPr>
-        <w:t>Used in Flutter.</w:t>
-      </w:r>
-    </w:p>
-    <w:p>
-      <w:pPr>
-        <w:spacing w:after="100" w:afterAutospacing="1" w:line="390" w:lineRule="atLeast"/>
-        <w:rPr>
-          <w:rFonts w:ascii="Times New Roman" w:eastAsia="Times New Roman" w:hAnsi="Times New Roman" w:cs="Times New Roman"/>
-          <w:b/>
-          <w:bCs/>
-          <w:color w:val="0D0D0D"/>
-          <w:sz w:val="24"/>
-          <w:szCs w:val="24"/>
-        </w:rPr>
-      </w:pPr>
-      <w:r>
-        <w:rPr>
-          <w:rFonts w:ascii="Times New Roman" w:eastAsia="Times New Roman" w:hAnsi="Times New Roman" w:cs="Times New Roman"/>
-          <w:b/>
-          <w:bCs/>
-          <w:color w:val="0D0D0D"/>
-          <w:sz w:val="24"/>
-          <w:szCs w:val="24"/>
-        </w:rPr>
-        <w:t>Advantages:</w:t>
-      </w:r>
-    </w:p>
-    <w:p>
-      <w:pPr>
-        <w:numPr>
-          <w:ilvl w:val="0"/>
-          <w:numId w:val="24"/>
-        </w:numPr>
-        <w:spacing w:line="390" w:lineRule="atLeast"/>
-        <w:ind w:left="360"/>
-        <w:rPr>
-          <w:rFonts w:ascii="Times New Roman" w:eastAsia="Times New Roman" w:hAnsi="Times New Roman" w:cs="Times New Roman"/>
-          <w:color w:val="0D0D0D"/>
-          <w:sz w:val="24"/>
-          <w:szCs w:val="24"/>
-        </w:rPr>
-      </w:pPr>
-      <w:r>
-        <w:rPr>
-          <w:rFonts w:ascii="Times New Roman" w:eastAsia="Times New Roman" w:hAnsi="Times New Roman" w:cs="Times New Roman"/>
-          <w:color w:val="0D0D0D"/>
-          <w:sz w:val="24"/>
-          <w:szCs w:val="24"/>
-        </w:rPr>
-        <w:t>Fast UI rendering</w:t>
-      </w:r>
-    </w:p>
-    <w:p>
-      <w:pPr>
-        <w:numPr>
-          <w:ilvl w:val="0"/>
-          <w:numId w:val="24"/>
-        </w:numPr>
-        <w:spacing w:line="390" w:lineRule="atLeast"/>
-        <w:ind w:left="360"/>
-        <w:rPr>
-          <w:rFonts w:ascii="Times New Roman" w:eastAsia="Times New Roman" w:hAnsi="Times New Roman" w:cs="Times New Roman"/>
-          <w:color w:val="0D0D0D"/>
-          <w:sz w:val="24"/>
-          <w:szCs w:val="24"/>
-        </w:rPr>
-      </w:pPr>
-      <w:r>
-        <w:rPr>
-          <w:rFonts w:ascii="Times New Roman" w:eastAsia="Times New Roman" w:hAnsi="Times New Roman" w:cs="Times New Roman"/>
-          <w:color w:val="0D0D0D"/>
-          <w:sz w:val="24"/>
-          <w:szCs w:val="24"/>
-        </w:rPr>
-        <w:t>Good performance</w:t>
-      </w:r>
-    </w:p>
-    <w:p>
-      <w:pPr>
-        <w:numPr>
-          <w:ilvl w:val="0"/>
-          <w:numId w:val="24"/>
-        </w:numPr>
-        <w:spacing w:line="390" w:lineRule="atLeast"/>
-        <w:ind w:left="360"/>
-        <w:rPr>
-          <w:rFonts w:ascii="Times New Roman" w:eastAsia="Times New Roman" w:hAnsi="Times New Roman" w:cs="Times New Roman"/>
-          <w:color w:val="0D0D0D"/>
-          <w:sz w:val="24"/>
-          <w:szCs w:val="24"/>
-        </w:rPr>
-      </w:pPr>
-      <w:r>
-        <w:rPr>
-          <w:rFonts w:ascii="Times New Roman" w:eastAsia="Times New Roman" w:hAnsi="Times New Roman" w:cs="Times New Roman"/>
-          <w:color w:val="0D0D0D"/>
-          <w:sz w:val="24"/>
-          <w:szCs w:val="24"/>
-        </w:rPr>
-        <w:t>Easy learning</w:t>
-      </w:r>
-    </w:p>
-    <w:p>
-      <w:pPr>
-        <w:spacing w:after="100" w:afterAutospacing="1" w:line="390" w:lineRule="atLeast"/>
-        <w:rPr>
-          <w:rFonts w:ascii="Times New Roman" w:eastAsia="Times New Roman" w:hAnsi="Times New Roman" w:cs="Times New Roman"/>
-          <w:b/>
-          <w:bCs/>
-          <w:color w:val="0D0D0D"/>
-          <w:sz w:val="24"/>
-          <w:szCs w:val="24"/>
-        </w:rPr>
-      </w:pPr>
-      <w:r>
-        <w:rPr>
-          <w:rFonts w:ascii="Times New Roman" w:eastAsia="Times New Roman" w:hAnsi="Times New Roman" w:cs="Times New Roman"/>
-          <w:b/>
-          <w:bCs/>
-          <w:color w:val="0D0D0D"/>
-          <w:sz w:val="24"/>
-          <w:szCs w:val="24"/>
-        </w:rPr>
-        <w:t>Disadvantages:</w:t>
-      </w:r>
-    </w:p>
-    <w:p>
-      <w:pPr>
-        <w:numPr>
-          <w:ilvl w:val="0"/>
-          <w:numId w:val="25"/>
-        </w:numPr>
-        <w:spacing w:line="390" w:lineRule="atLeast"/>
-        <w:ind w:left="360"/>
-        <w:rPr>
-          <w:rFonts w:ascii="Times New Roman" w:eastAsia="Times New Roman" w:hAnsi="Times New Roman" w:cs="Times New Roman"/>
-          <w:color w:val="0D0D0D"/>
-          <w:sz w:val="24"/>
-          <w:szCs w:val="24"/>
-        </w:rPr>
-      </w:pPr>
-      <w:r>
-        <w:rPr>
-          <w:rFonts w:ascii="Times New Roman" w:eastAsia="Times New Roman" w:hAnsi="Times New Roman" w:cs="Times New Roman"/>
-          <w:color w:val="0D0D0D"/>
-          <w:sz w:val="24"/>
-          <w:szCs w:val="24"/>
-        </w:rPr>
-        <w:t>Smaller community than JavaScript</w:t>
-      </w:r>
-    </w:p>
-    <w:p>
-      <w:pPr>
-        <w:spacing w:line="390" w:lineRule="atLeast"/>
-        <w:rPr>
-          <w:rFonts w:ascii="Times New Roman" w:eastAsia="Times New Roman" w:hAnsi="Times New Roman" w:cs="Times New Roman"/>
-          <w:color w:val="0D0D0D"/>
-          <w:sz w:val="24"/>
-          <w:szCs w:val="24"/>
-        </w:rPr>
-      </w:pPr>
-    </w:p>
-    <w:p>
-      <w:pPr>
-        <w:pStyle w:val="Heading2"/>
-      </w:pPr>
-      <w:r>
-        <w:t>3. Mobile Development Frameworks</w:t>
+          <w:sz w:val="24"/>
+          <w:szCs w:val="24"/>
+        </w:rPr>
+        <w:t>mobile app development framework</w:t>
+      </w:r>
+      <w:r>
+        <w:rPr>
+          <w:rFonts w:ascii="Times New Roman" w:eastAsia="Times New Roman" w:hAnsi="Times New Roman" w:cs="Times New Roman"/>
+          <w:sz w:val="24"/>
+          <w:szCs w:val="24"/>
+        </w:rPr>
+        <w:t xml:space="preserve"> is a software platform that provides tools, libraries, APIs, and pre-written code to simplify mobile application development.</w:t>
       </w:r>
     </w:p>
     <w:p>
@@ -4210,43 +2207,6 @@
           <w:sz w:val="24"/>
           <w:szCs w:val="24"/>
         </w:rPr>
-        <w:t xml:space="preserve">A </w:t>
-      </w:r>
-      <w:r>
-        <w:rPr>
-          <w:rFonts w:ascii="Times New Roman" w:eastAsia="Times New Roman" w:hAnsi="Times New Roman" w:cs="Times New Roman"/>
-          <w:b/>
-          <w:bCs/>
-          <w:sz w:val="24"/>
-          <w:szCs w:val="24"/>
-        </w:rPr>
-        <w:t>mobile app development framework</w:t>
-      </w:r>
-      <w:r>
-        <w:rPr>
-          <w:rFonts w:ascii="Times New Roman" w:eastAsia="Times New Roman" w:hAnsi="Times New Roman" w:cs="Times New Roman"/>
-          <w:sz w:val="24"/>
-          <w:szCs w:val="24"/>
-        </w:rPr>
-        <w:t xml:space="preserve"> is a software platform that provides tools, libraries, APIs, and pre-written code to simplify mobile application development.</w:t>
-      </w:r>
-    </w:p>
-    <w:p>
-      <w:pPr>
-        <w:spacing w:line="360" w:lineRule="auto"/>
-        <w:rPr>
-          <w:rFonts w:ascii="Times New Roman" w:eastAsia="Times New Roman" w:hAnsi="Times New Roman" w:cs="Times New Roman"/>
-          <w:sz w:val="24"/>
-          <w:szCs w:val="24"/>
-        </w:rPr>
-      </w:pPr>
-      <w:r>
-        <w:rPr>
-          <w:rFonts w:ascii="Times New Roman" w:eastAsia="Times New Roman" w:hAnsi="Times New Roman" w:cs="Times New Roman"/>
-          <w:sz w:val="24"/>
-          <w:szCs w:val="24"/>
-        </w:rPr>
-        <w:lastRenderedPageBreak/>
         <w:t>Frameworks help developers:</w:t>
       </w:r>
     </w:p>
@@ -4589,6 +2549,7 @@
           <w:sz w:val="24"/>
           <w:szCs w:val="24"/>
         </w:rPr>
+        <w:lastRenderedPageBreak/>
         <w:t>Code reuse</w:t>
       </w:r>
     </w:p>
@@ -4780,7 +2741,6 @@
           <w:sz w:val="24"/>
           <w:szCs w:val="24"/>
         </w:rPr>
-        <w:lastRenderedPageBreak/>
         <w:t>E-commerce apps</w:t>
       </w:r>
     </w:p>
@@ -5297,7 +3257,6 @@
           <w:sz w:val="24"/>
           <w:szCs w:val="24"/>
         </w:rPr>
-        <w:lastRenderedPageBreak/>
         <w:t>Enterprise support</w:t>
       </w:r>
     </w:p>
@@ -5601,6 +3560,7 @@
           <w:sz w:val="24"/>
           <w:szCs w:val="24"/>
         </w:rPr>
+        <w:lastRenderedPageBreak/>
         <w:t>In this architecture, the presenter sits between the Model and the View, manually pushing updates to the UI whenever the data changes.</w:t>
       </w:r>
     </w:p>
@@ -5745,7 +3705,6 @@
           <w:sz w:val="24"/>
           <w:szCs w:val="24"/>
         </w:rPr>
-        <w:lastRenderedPageBreak/>
         <w:t xml:space="preserve">In this architecture, the </w:t>
       </w:r>
       <w:proofErr w:type="spellStart"/>
@@ -6081,6 +4040,7 @@
           <w:sz w:val="24"/>
           <w:szCs w:val="24"/>
         </w:rPr>
+        <w:lastRenderedPageBreak/>
         <w:t xml:space="preserve">In order to ensure that various user requirements are met, requirements are documented. Some tools for documentation of requirements are </w:t>
       </w:r>
       <w:r>
@@ -6303,7 +4263,6 @@
           <w:sz w:val="24"/>
           <w:szCs w:val="24"/>
         </w:rPr>
-        <w:lastRenderedPageBreak/>
         <w:t>Resources like developers and application features like authentication, API integration, cloud storage are also factors which increase the cost of development of mobile applications.</w:t>
       </w:r>
     </w:p>
@@ -11890,6 +9849,119 @@
     </w:lvl>
   </w:abstractNum>
   <w:abstractNum w:abstractNumId="35" w15:restartNumberingAfterBreak="0">
+    <w:nsid w:val="5BE6606F"/>
+    <w:multiLevelType w:val="hybridMultilevel"/>
+    <w:tmpl w:val="DCFC5482"/>
+    <w:lvl w:ilvl="0" w:tplc="1F5A3D3E">
+      <w:start w:val="2"/>
+      <w:numFmt w:val="bullet"/>
+      <w:lvlText w:val="-"/>
+      <w:lvlJc w:val="left"/>
+      <w:pPr>
+        <w:ind w:left="720" w:hanging="360"/>
+      </w:pPr>
+      <w:rPr>
+        <w:rFonts w:ascii="Times New Roman" w:eastAsia="Times New Roman" w:hAnsi="Times New Roman" w:cs="Times New Roman" w:hint="default"/>
+      </w:rPr>
+    </w:lvl>
+    <w:lvl w:ilvl="1" w:tplc="04090003" w:tentative="1">
+      <w:start w:val="1"/>
+      <w:numFmt w:val="bullet"/>
+      <w:lvlText w:val="o"/>
+      <w:lvlJc w:val="left"/>
+      <w:pPr>
+        <w:ind w:left="1440" w:hanging="360"/>
+      </w:pPr>
+      <w:rPr>
+        <w:rFonts w:ascii="Courier New" w:hAnsi="Courier New" w:cs="Courier New" w:hint="default"/>
+      </w:rPr>
+    </w:lvl>
+    <w:lvl w:ilvl="2" w:tplc="04090005" w:tentative="1">
+      <w:start w:val="1"/>
+      <w:numFmt w:val="bullet"/>
+      <w:lvlText w:val=""/>
+      <w:lvlJc w:val="left"/>
+      <w:pPr>
+        <w:ind w:left="2160" w:hanging="360"/>
+      </w:pPr>
+      <w:rPr>
+        <w:rFonts w:ascii="Wingdings" w:hAnsi="Wingdings" w:hint="default"/>
+      </w:rPr>
+    </w:lvl>
+    <w:lvl w:ilvl="3" w:tplc="04090001" w:tentative="1">
+      <w:start w:val="1"/>
+      <w:numFmt w:val="bullet"/>
+      <w:lvlText w:val=""/>
+      <w:lvlJc w:val="left"/>
+      <w:pPr>
+        <w:ind w:left="2880" w:hanging="360"/>
+      </w:pPr>
+      <w:rPr>
+        <w:rFonts w:ascii="Symbol" w:hAnsi="Symbol" w:hint="default"/>
+      </w:rPr>
+    </w:lvl>
+    <w:lvl w:ilvl="4" w:tplc="04090003" w:tentative="1">
+      <w:start w:val="1"/>
+      <w:numFmt w:val="bullet"/>
+      <w:lvlText w:val="o"/>
+      <w:lvlJc w:val="left"/>
+      <w:pPr>
+        <w:ind w:left="3600" w:hanging="360"/>
+      </w:pPr>
+      <w:rPr>
+        <w:rFonts w:ascii="Courier New" w:hAnsi="Courier New" w:cs="Courier New" w:hint="default"/>
+      </w:rPr>
+    </w:lvl>
+    <w:lvl w:ilvl="5" w:tplc="04090005" w:tentative="1">
+      <w:start w:val="1"/>
+      <w:numFmt w:val="bullet"/>
+      <w:lvlText w:val=""/>
+      <w:lvlJc w:val="left"/>
+      <w:pPr>
+        <w:ind w:left="4320" w:hanging="360"/>
+      </w:pPr>
+      <w:rPr>
+        <w:rFonts w:ascii="Wingdings" w:hAnsi="Wingdings" w:hint="default"/>
+      </w:rPr>
+    </w:lvl>
+    <w:lvl w:ilvl="6" w:tplc="04090001" w:tentative="1">
+      <w:start w:val="1"/>
+      <w:numFmt w:val="bullet"/>
+      <w:lvlText w:val=""/>
+      <w:lvlJc w:val="left"/>
+      <w:pPr>
+        <w:ind w:left="5040" w:hanging="360"/>
+      </w:pPr>
+      <w:rPr>
+        <w:rFonts w:ascii="Symbol" w:hAnsi="Symbol" w:hint="default"/>
+      </w:rPr>
+    </w:lvl>
+    <w:lvl w:ilvl="7" w:tplc="04090003" w:tentative="1">
+      <w:start w:val="1"/>
+      <w:numFmt w:val="bullet"/>
+      <w:lvlText w:val="o"/>
+      <w:lvlJc w:val="left"/>
+      <w:pPr>
+        <w:ind w:left="5760" w:hanging="360"/>
+      </w:pPr>
+      <w:rPr>
+        <w:rFonts w:ascii="Courier New" w:hAnsi="Courier New" w:cs="Courier New" w:hint="default"/>
+      </w:rPr>
+    </w:lvl>
+    <w:lvl w:ilvl="8" w:tplc="04090005" w:tentative="1">
+      <w:start w:val="1"/>
+      <w:numFmt w:val="bullet"/>
+      <w:lvlText w:val=""/>
+      <w:lvlJc w:val="left"/>
+      <w:pPr>
+        <w:ind w:left="6480" w:hanging="360"/>
+      </w:pPr>
+      <w:rPr>
+        <w:rFonts w:ascii="Wingdings" w:hAnsi="Wingdings" w:hint="default"/>
+      </w:rPr>
+    </w:lvl>
+  </w:abstractNum>
+  <w:abstractNum w:abstractNumId="36" w15:restartNumberingAfterBreak="0">
     <w:nsid w:val="5C933ECB"/>
     <w:multiLevelType w:val="multilevel"/>
     <w:tmpl w:val="82661DE4"/>
@@ -12038,7 +10110,7 @@
       </w:rPr>
     </w:lvl>
   </w:abstractNum>
-  <w:abstractNum w:abstractNumId="36" w15:restartNumberingAfterBreak="0">
+  <w:abstractNum w:abstractNumId="37" w15:restartNumberingAfterBreak="0">
     <w:nsid w:val="5D2477E9"/>
     <w:multiLevelType w:val="multilevel"/>
     <w:tmpl w:val="0D9C54A8"/>
@@ -12187,7 +10259,7 @@
       </w:rPr>
     </w:lvl>
   </w:abstractNum>
-  <w:abstractNum w:abstractNumId="37" w15:restartNumberingAfterBreak="0">
+  <w:abstractNum w:abstractNumId="38" w15:restartNumberingAfterBreak="0">
     <w:nsid w:val="5D344C65"/>
     <w:multiLevelType w:val="multilevel"/>
     <w:tmpl w:val="0BBCA45C"/>
@@ -12336,7 +10408,7 @@
       </w:rPr>
     </w:lvl>
   </w:abstractNum>
-  <w:abstractNum w:abstractNumId="38" w15:restartNumberingAfterBreak="0">
+  <w:abstractNum w:abstractNumId="39" w15:restartNumberingAfterBreak="0">
     <w:nsid w:val="5D752C51"/>
     <w:multiLevelType w:val="multilevel"/>
     <w:tmpl w:val="DC123446"/>
@@ -12485,7 +10557,7 @@
       </w:rPr>
     </w:lvl>
   </w:abstractNum>
-  <w:abstractNum w:abstractNumId="39" w15:restartNumberingAfterBreak="0">
+  <w:abstractNum w:abstractNumId="40" w15:restartNumberingAfterBreak="0">
     <w:nsid w:val="5EAF195E"/>
     <w:multiLevelType w:val="multilevel"/>
     <w:tmpl w:val="A10CE45A"/>
@@ -12634,7 +10706,7 @@
       </w:rPr>
     </w:lvl>
   </w:abstractNum>
-  <w:abstractNum w:abstractNumId="40" w15:restartNumberingAfterBreak="0">
+  <w:abstractNum w:abstractNumId="41" w15:restartNumberingAfterBreak="0">
     <w:nsid w:val="60D62E9D"/>
     <w:multiLevelType w:val="multilevel"/>
     <w:tmpl w:val="02723CB8"/>
@@ -12783,7 +10855,7 @@
       </w:rPr>
     </w:lvl>
   </w:abstractNum>
-  <w:abstractNum w:abstractNumId="41" w15:restartNumberingAfterBreak="0">
+  <w:abstractNum w:abstractNumId="42" w15:restartNumberingAfterBreak="0">
     <w:nsid w:val="63F44775"/>
     <w:multiLevelType w:val="multilevel"/>
     <w:tmpl w:val="1D42CC70"/>
@@ -12932,7 +11004,7 @@
       </w:rPr>
     </w:lvl>
   </w:abstractNum>
-  <w:abstractNum w:abstractNumId="42" w15:restartNumberingAfterBreak="0">
+  <w:abstractNum w:abstractNumId="43" w15:restartNumberingAfterBreak="0">
     <w:nsid w:val="64CD5F28"/>
     <w:multiLevelType w:val="multilevel"/>
     <w:tmpl w:val="A810DCE4"/>
@@ -13081,7 +11153,7 @@
       </w:rPr>
     </w:lvl>
   </w:abstractNum>
-  <w:abstractNum w:abstractNumId="43" w15:restartNumberingAfterBreak="0">
+  <w:abstractNum w:abstractNumId="44" w15:restartNumberingAfterBreak="0">
     <w:nsid w:val="65006EA9"/>
     <w:multiLevelType w:val="multilevel"/>
     <w:tmpl w:val="17FED95A"/>
@@ -13230,7 +11302,7 @@
       </w:rPr>
     </w:lvl>
   </w:abstractNum>
-  <w:abstractNum w:abstractNumId="44" w15:restartNumberingAfterBreak="0">
+  <w:abstractNum w:abstractNumId="45" w15:restartNumberingAfterBreak="0">
     <w:nsid w:val="66BF6E09"/>
     <w:multiLevelType w:val="multilevel"/>
     <w:tmpl w:val="23E464A6"/>
@@ -13379,7 +11451,7 @@
       </w:rPr>
     </w:lvl>
   </w:abstractNum>
-  <w:abstractNum w:abstractNumId="45" w15:restartNumberingAfterBreak="0">
+  <w:abstractNum w:abstractNumId="46" w15:restartNumberingAfterBreak="0">
     <w:nsid w:val="67C5319F"/>
     <w:multiLevelType w:val="multilevel"/>
     <w:tmpl w:val="DE54ECE6"/>
@@ -13528,7 +11600,7 @@
       </w:rPr>
     </w:lvl>
   </w:abstractNum>
-  <w:abstractNum w:abstractNumId="46" w15:restartNumberingAfterBreak="0">
+  <w:abstractNum w:abstractNumId="47" w15:restartNumberingAfterBreak="0">
     <w:nsid w:val="686B1160"/>
     <w:multiLevelType w:val="multilevel"/>
     <w:tmpl w:val="6ED43A9A"/>
@@ -13677,7 +11749,7 @@
       </w:rPr>
     </w:lvl>
   </w:abstractNum>
-  <w:abstractNum w:abstractNumId="47" w15:restartNumberingAfterBreak="0">
+  <w:abstractNum w:abstractNumId="48" w15:restartNumberingAfterBreak="0">
     <w:nsid w:val="68CA5089"/>
     <w:multiLevelType w:val="multilevel"/>
     <w:tmpl w:val="BB7E82A8"/>
@@ -13790,7 +11862,120 @@
       </w:pPr>
     </w:lvl>
   </w:abstractNum>
-  <w:abstractNum w:abstractNumId="48" w15:restartNumberingAfterBreak="0">
+  <w:abstractNum w:abstractNumId="49" w15:restartNumberingAfterBreak="0">
+    <w:nsid w:val="6934426C"/>
+    <w:multiLevelType w:val="hybridMultilevel"/>
+    <w:tmpl w:val="6694BF22"/>
+    <w:lvl w:ilvl="0" w:tplc="04090001">
+      <w:start w:val="1"/>
+      <w:numFmt w:val="bullet"/>
+      <w:lvlText w:val=""/>
+      <w:lvlJc w:val="left"/>
+      <w:pPr>
+        <w:ind w:left="720" w:hanging="360"/>
+      </w:pPr>
+      <w:rPr>
+        <w:rFonts w:ascii="Symbol" w:hAnsi="Symbol" w:hint="default"/>
+      </w:rPr>
+    </w:lvl>
+    <w:lvl w:ilvl="1" w:tplc="04090003" w:tentative="1">
+      <w:start w:val="1"/>
+      <w:numFmt w:val="bullet"/>
+      <w:lvlText w:val="o"/>
+      <w:lvlJc w:val="left"/>
+      <w:pPr>
+        <w:ind w:left="1440" w:hanging="360"/>
+      </w:pPr>
+      <w:rPr>
+        <w:rFonts w:ascii="Courier New" w:hAnsi="Courier New" w:cs="Courier New" w:hint="default"/>
+      </w:rPr>
+    </w:lvl>
+    <w:lvl w:ilvl="2" w:tplc="04090005" w:tentative="1">
+      <w:start w:val="1"/>
+      <w:numFmt w:val="bullet"/>
+      <w:lvlText w:val=""/>
+      <w:lvlJc w:val="left"/>
+      <w:pPr>
+        <w:ind w:left="2160" w:hanging="360"/>
+      </w:pPr>
+      <w:rPr>
+        <w:rFonts w:ascii="Wingdings" w:hAnsi="Wingdings" w:hint="default"/>
+      </w:rPr>
+    </w:lvl>
+    <w:lvl w:ilvl="3" w:tplc="04090001" w:tentative="1">
+      <w:start w:val="1"/>
+      <w:numFmt w:val="bullet"/>
+      <w:lvlText w:val=""/>
+      <w:lvlJc w:val="left"/>
+      <w:pPr>
+        <w:ind w:left="2880" w:hanging="360"/>
+      </w:pPr>
+      <w:rPr>
+        <w:rFonts w:ascii="Symbol" w:hAnsi="Symbol" w:hint="default"/>
+      </w:rPr>
+    </w:lvl>
+    <w:lvl w:ilvl="4" w:tplc="04090003" w:tentative="1">
+      <w:start w:val="1"/>
+      <w:numFmt w:val="bullet"/>
+      <w:lvlText w:val="o"/>
+      <w:lvlJc w:val="left"/>
+      <w:pPr>
+        <w:ind w:left="3600" w:hanging="360"/>
+      </w:pPr>
+      <w:rPr>
+        <w:rFonts w:ascii="Courier New" w:hAnsi="Courier New" w:cs="Courier New" w:hint="default"/>
+      </w:rPr>
+    </w:lvl>
+    <w:lvl w:ilvl="5" w:tplc="04090005" w:tentative="1">
+      <w:start w:val="1"/>
+      <w:numFmt w:val="bullet"/>
+      <w:lvlText w:val=""/>
+      <w:lvlJc w:val="left"/>
+      <w:pPr>
+        <w:ind w:left="4320" w:hanging="360"/>
+      </w:pPr>
+      <w:rPr>
+        <w:rFonts w:ascii="Wingdings" w:hAnsi="Wingdings" w:hint="default"/>
+      </w:rPr>
+    </w:lvl>
+    <w:lvl w:ilvl="6" w:tplc="04090001" w:tentative="1">
+      <w:start w:val="1"/>
+      <w:numFmt w:val="bullet"/>
+      <w:lvlText w:val=""/>
+      <w:lvlJc w:val="left"/>
+      <w:pPr>
+        <w:ind w:left="5040" w:hanging="360"/>
+      </w:pPr>
+      <w:rPr>
+        <w:rFonts w:ascii="Symbol" w:hAnsi="Symbol" w:hint="default"/>
+      </w:rPr>
+    </w:lvl>
+    <w:lvl w:ilvl="7" w:tplc="04090003" w:tentative="1">
+      <w:start w:val="1"/>
+      <w:numFmt w:val="bullet"/>
+      <w:lvlText w:val="o"/>
+      <w:lvlJc w:val="left"/>
+      <w:pPr>
+        <w:ind w:left="5760" w:hanging="360"/>
+      </w:pPr>
+      <w:rPr>
+        <w:rFonts w:ascii="Courier New" w:hAnsi="Courier New" w:cs="Courier New" w:hint="default"/>
+      </w:rPr>
+    </w:lvl>
+    <w:lvl w:ilvl="8" w:tplc="04090005" w:tentative="1">
+      <w:start w:val="1"/>
+      <w:numFmt w:val="bullet"/>
+      <w:lvlText w:val=""/>
+      <w:lvlJc w:val="left"/>
+      <w:pPr>
+        <w:ind w:left="6480" w:hanging="360"/>
+      </w:pPr>
+      <w:rPr>
+        <w:rFonts w:ascii="Wingdings" w:hAnsi="Wingdings" w:hint="default"/>
+      </w:rPr>
+    </w:lvl>
+  </w:abstractNum>
+  <w:abstractNum w:abstractNumId="50" w15:restartNumberingAfterBreak="0">
     <w:nsid w:val="6A8C4F19"/>
     <w:multiLevelType w:val="multilevel"/>
     <w:tmpl w:val="6BCC00BA"/>
@@ -13939,7 +12124,7 @@
       </w:rPr>
     </w:lvl>
   </w:abstractNum>
-  <w:abstractNum w:abstractNumId="49" w15:restartNumberingAfterBreak="0">
+  <w:abstractNum w:abstractNumId="51" w15:restartNumberingAfterBreak="0">
     <w:nsid w:val="6B9347BE"/>
     <w:multiLevelType w:val="multilevel"/>
     <w:tmpl w:val="F74A8600"/>
@@ -14088,7 +12273,7 @@
       </w:rPr>
     </w:lvl>
   </w:abstractNum>
-  <w:abstractNum w:abstractNumId="50" w15:restartNumberingAfterBreak="0">
+  <w:abstractNum w:abstractNumId="52" w15:restartNumberingAfterBreak="0">
     <w:nsid w:val="71227AA1"/>
     <w:multiLevelType w:val="multilevel"/>
     <w:tmpl w:val="9314E758"/>
@@ -14237,7 +12422,7 @@
       </w:rPr>
     </w:lvl>
   </w:abstractNum>
-  <w:abstractNum w:abstractNumId="51" w15:restartNumberingAfterBreak="0">
+  <w:abstractNum w:abstractNumId="53" w15:restartNumberingAfterBreak="0">
     <w:nsid w:val="716F76B6"/>
     <w:multiLevelType w:val="hybridMultilevel"/>
     <w:tmpl w:val="D34245DE"/>
@@ -14326,7 +12511,7 @@
       </w:pPr>
     </w:lvl>
   </w:abstractNum>
-  <w:abstractNum w:abstractNumId="52" w15:restartNumberingAfterBreak="0">
+  <w:abstractNum w:abstractNumId="54" w15:restartNumberingAfterBreak="0">
     <w:nsid w:val="756D1D78"/>
     <w:multiLevelType w:val="multilevel"/>
     <w:tmpl w:val="92F431D4"/>
@@ -14475,7 +12660,7 @@
       </w:rPr>
     </w:lvl>
   </w:abstractNum>
-  <w:abstractNum w:abstractNumId="53" w15:restartNumberingAfterBreak="0">
+  <w:abstractNum w:abstractNumId="55" w15:restartNumberingAfterBreak="0">
     <w:nsid w:val="773920B2"/>
     <w:multiLevelType w:val="multilevel"/>
     <w:tmpl w:val="01A46B20"/>
@@ -14624,7 +12809,7 @@
       </w:rPr>
     </w:lvl>
   </w:abstractNum>
-  <w:abstractNum w:abstractNumId="54" w15:restartNumberingAfterBreak="0">
+  <w:abstractNum w:abstractNumId="56" w15:restartNumberingAfterBreak="0">
     <w:nsid w:val="7B9F537A"/>
     <w:multiLevelType w:val="multilevel"/>
     <w:tmpl w:val="849E2410"/>
@@ -14773,7 +12958,7 @@
       </w:rPr>
     </w:lvl>
   </w:abstractNum>
-  <w:abstractNum w:abstractNumId="55" w15:restartNumberingAfterBreak="0">
+  <w:abstractNum w:abstractNumId="57" w15:restartNumberingAfterBreak="0">
     <w:nsid w:val="7E6E0BEC"/>
     <w:multiLevelType w:val="multilevel"/>
     <w:tmpl w:val="2E06E3F4"/>
@@ -14923,7 +13108,7 @@
     </w:lvl>
   </w:abstractNum>
   <w:num w:numId="1" w16cid:durableId="1194461476">
-    <w:abstractNumId w:val="49"/>
+    <w:abstractNumId w:val="51"/>
   </w:num>
   <w:num w:numId="2" w16cid:durableId="224728520">
     <w:abstractNumId w:val="9"/>
@@ -14935,13 +13120,13 @@
     <w:abstractNumId w:val="2"/>
   </w:num>
   <w:num w:numId="5" w16cid:durableId="2017685981">
-    <w:abstractNumId w:val="43"/>
+    <w:abstractNumId w:val="44"/>
   </w:num>
   <w:num w:numId="6" w16cid:durableId="766972457">
-    <w:abstractNumId w:val="55"/>
+    <w:abstractNumId w:val="57"/>
   </w:num>
   <w:num w:numId="7" w16cid:durableId="1988049983">
-    <w:abstractNumId w:val="35"/>
+    <w:abstractNumId w:val="36"/>
   </w:num>
   <w:num w:numId="8" w16cid:durableId="1044791148">
     <w:abstractNumId w:val="12"/>
@@ -14953,7 +13138,7 @@
     <w:abstractNumId w:val="20"/>
   </w:num>
   <w:num w:numId="11" w16cid:durableId="1230381344">
-    <w:abstractNumId w:val="46"/>
+    <w:abstractNumId w:val="47"/>
   </w:num>
   <w:num w:numId="12" w16cid:durableId="419256562">
     <w:abstractNumId w:val="23"/>
@@ -14965,16 +13150,16 @@
     <w:abstractNumId w:val="16"/>
   </w:num>
   <w:num w:numId="15" w16cid:durableId="772820272">
-    <w:abstractNumId w:val="50"/>
+    <w:abstractNumId w:val="52"/>
   </w:num>
   <w:num w:numId="16" w16cid:durableId="1917082377">
-    <w:abstractNumId w:val="38"/>
+    <w:abstractNumId w:val="39"/>
   </w:num>
   <w:num w:numId="17" w16cid:durableId="528295882">
-    <w:abstractNumId w:val="40"/>
+    <w:abstractNumId w:val="41"/>
   </w:num>
   <w:num w:numId="18" w16cid:durableId="294529758">
-    <w:abstractNumId w:val="41"/>
+    <w:abstractNumId w:val="42"/>
   </w:num>
   <w:num w:numId="19" w16cid:durableId="351298228">
     <w:abstractNumId w:val="26"/>
@@ -14983,7 +13168,7 @@
     <w:abstractNumId w:val="21"/>
   </w:num>
   <w:num w:numId="21" w16cid:durableId="187372896">
-    <w:abstractNumId w:val="36"/>
+    <w:abstractNumId w:val="37"/>
   </w:num>
   <w:num w:numId="22" w16cid:durableId="510145394">
     <w:abstractNumId w:val="5"/>
@@ -14995,7 +13180,7 @@
     <w:abstractNumId w:val="1"/>
   </w:num>
   <w:num w:numId="25" w16cid:durableId="1172336169">
-    <w:abstractNumId w:val="53"/>
+    <w:abstractNumId w:val="55"/>
   </w:num>
   <w:num w:numId="26" w16cid:durableId="823358324">
     <w:abstractNumId w:val="27"/>
@@ -15025,10 +13210,10 @@
     <w:abstractNumId w:val="0"/>
   </w:num>
   <w:num w:numId="35" w16cid:durableId="1799450803">
-    <w:abstractNumId w:val="44"/>
+    <w:abstractNumId w:val="45"/>
   </w:num>
   <w:num w:numId="36" w16cid:durableId="1200779958">
-    <w:abstractNumId w:val="48"/>
+    <w:abstractNumId w:val="50"/>
   </w:num>
   <w:num w:numId="37" w16cid:durableId="1748920375">
     <w:abstractNumId w:val="17"/>
@@ -15046,16 +13231,16 @@
     <w:abstractNumId w:val="11"/>
   </w:num>
   <w:num w:numId="42" w16cid:durableId="700588536">
-    <w:abstractNumId w:val="42"/>
+    <w:abstractNumId w:val="43"/>
   </w:num>
   <w:num w:numId="43" w16cid:durableId="1639797587">
-    <w:abstractNumId w:val="45"/>
+    <w:abstractNumId w:val="46"/>
   </w:num>
   <w:num w:numId="44" w16cid:durableId="923756903">
-    <w:abstractNumId w:val="37"/>
+    <w:abstractNumId w:val="38"/>
   </w:num>
   <w:num w:numId="45" w16cid:durableId="440228789">
-    <w:abstractNumId w:val="52"/>
+    <w:abstractNumId w:val="54"/>
   </w:num>
   <w:num w:numId="46" w16cid:durableId="192771741">
     <w:abstractNumId w:val="6"/>
@@ -15064,7 +13249,7 @@
     <w:abstractNumId w:val="13"/>
   </w:num>
   <w:num w:numId="48" w16cid:durableId="290325897">
-    <w:abstractNumId w:val="54"/>
+    <w:abstractNumId w:val="56"/>
   </w:num>
   <w:num w:numId="49" w16cid:durableId="1625573534">
     <w:abstractNumId w:val="3"/>
@@ -15076,10 +13261,10 @@
     <w:abstractNumId w:val="19"/>
   </w:num>
   <w:num w:numId="52" w16cid:durableId="1019426750">
-    <w:abstractNumId w:val="47"/>
+    <w:abstractNumId w:val="48"/>
   </w:num>
   <w:num w:numId="53" w16cid:durableId="194318043">
-    <w:abstractNumId w:val="39"/>
+    <w:abstractNumId w:val="40"/>
   </w:num>
   <w:num w:numId="54" w16cid:durableId="734397254">
     <w:abstractNumId w:val="32"/>
@@ -15088,7 +13273,13 @@
     <w:abstractNumId w:val="15"/>
   </w:num>
   <w:num w:numId="56" w16cid:durableId="840854070">
-    <w:abstractNumId w:val="51"/>
+    <w:abstractNumId w:val="53"/>
+  </w:num>
+  <w:num w:numId="57" w16cid:durableId="462815722">
+    <w:abstractNumId w:val="35"/>
+  </w:num>
+  <w:num w:numId="58" w16cid:durableId="1028067334">
+    <w:abstractNumId w:val="49"/>
   </w:num>
   <w:numIdMacAtCleanup w:val="52"/>
 </w:numbering>
@@ -15760,6 +13951,17 @@
       </w:tblBorders>
     </w:tblPr>
   </w:style>
+  <w:style w:type="paragraph" w:styleId="ListParagraph">
+    <w:name w:val="List Paragraph"/>
+    <w:basedOn w:val="Normal"/>
+    <w:uiPriority w:val="34"/>
+    <w:qFormat/>
+    <w:rsid w:val="00D2376C"/>
+    <w:pPr>
+      <w:ind w:left="720"/>
+      <w:contextualSpacing/>
+    </w:pPr>
+  </w:style>
 </w:styles>
 </file>
 

</xml_diff>